<commit_message>
Add guest reporting feature and update report files
</commit_message>
<xml_diff>
--- a/outputs/final-report/HMMS_COMBINED_FINAL_REPORT.docx
+++ b/outputs/final-report/HMMS_COMBINED_FINAL_REPORT.docx
@@ -528,7 +528,7 @@
           <w:b w:val="0"/>
           <w:sz w:val="22"/>
         </w:rPr>
-        <w:t>Testing was completed for the Hotel Maintenance Management System, a Laravel-based web application that supports authentication, dashboard monitoring, maintenance request management, task assignment, task status progression, notifications and profile management. The assessment combined manual functional validation, visual verification of the running application, source-level traceability and the existing automated regression suite.</w:t>
+        <w:t>Testing was completed for the Hotel Maintenance Management System, a Laravel-based web application that supports administrator, receptionist, maintenance staff and guest reporting workflows. The system supports authentication, dashboard monitoring, guest maintenance reporting, request management, task assignment, task status progression, notifications and profile management. The assessment combined manual functional validation, visual verification of the running application, source-level traceability and the existing automated regression suite.</w:t>
       </w:r>
     </w:p>
     <w:tbl>
@@ -622,7 +622,7 @@
                 <w:b w:val="0"/>
                 <w:sz w:val="18"/>
               </w:rPr>
-              <w:t>18</w:t>
+              <w:t>21</w:t>
             </w:r>
           </w:p>
         </w:tc>
@@ -660,7 +660,7 @@
                 <w:b w:val="0"/>
                 <w:sz w:val="18"/>
               </w:rPr>
-              <w:t>18</w:t>
+              <w:t>21</w:t>
             </w:r>
           </w:p>
         </w:tc>
@@ -812,7 +812,7 @@
                 <w:b w:val="0"/>
                 <w:sz w:val="18"/>
               </w:rPr>
-              <w:t>25 passed (62 assertions)</w:t>
+              <w:t>26 passed (65 assertions)</w:t>
             </w:r>
           </w:p>
         </w:tc>
@@ -935,6 +935,14 @@
       </w:pPr>
       <w:r>
         <w:t>•  Validate navigation and integration between requests, tasks, users and notifications.</w:t>
+      </w:r>
+    </w:p>
+    <w:p>
+      <w:pPr>
+        <w:ind w:left="360" w:hanging="259"/>
+      </w:pPr>
+      <w:r>
+        <w:t>•  Confirm guest reporting without exposing protected maintenance data.</w:t>
       </w:r>
     </w:p>
     <w:p>
@@ -1080,6 +1088,44 @@
                 <w:b w:val="0"/>
                 <w:sz w:val="18"/>
               </w:rPr>
+              <w:t>Guest Access</w:t>
+            </w:r>
+          </w:p>
+        </w:tc>
+        <w:tc>
+          <w:tcPr>
+            <w:tcW w:type="dxa" w:w="6624"/>
+            <w:vAlign w:val="center"/>
+            <w:shd w:fill="FFFFFF"/>
+          </w:tcPr>
+          <w:p>
+            <w:r/>
+            <w:r>
+              <w:rPr>
+                <w:rFonts w:ascii="Arial" w:hAnsi="Arial"/>
+                <w:b w:val="0"/>
+                <w:sz w:val="18"/>
+              </w:rPr>
+              <w:t>Continue as Guest link, public report page and protected-route restrictions</w:t>
+            </w:r>
+          </w:p>
+        </w:tc>
+      </w:tr>
+      <w:tr>
+        <w:tc>
+          <w:tcPr>
+            <w:tcW w:type="dxa" w:w="2880"/>
+            <w:vAlign w:val="center"/>
+            <w:shd w:fill="F3F6FA"/>
+          </w:tcPr>
+          <w:p>
+            <w:r/>
+            <w:r>
+              <w:rPr>
+                <w:rFonts w:ascii="Arial" w:hAnsi="Arial"/>
+                <w:b w:val="0"/>
+                <w:sz w:val="18"/>
+              </w:rPr>
               <w:t>Dashboard</w:t>
             </w:r>
           </w:p>
@@ -1088,7 +1134,7 @@
           <w:tcPr>
             <w:tcW w:type="dxa" w:w="6624"/>
             <w:vAlign w:val="center"/>
-            <w:shd w:fill="FFFFFF"/>
+            <w:shd w:fill="F3F6FA"/>
           </w:tcPr>
           <w:p>
             <w:r/>
@@ -1108,7 +1154,7 @@
           <w:tcPr>
             <w:tcW w:type="dxa" w:w="2880"/>
             <w:vAlign w:val="center"/>
-            <w:shd w:fill="F3F6FA"/>
+            <w:shd w:fill="FFFFFF"/>
           </w:tcPr>
           <w:p>
             <w:r/>
@@ -1126,7 +1172,7 @@
           <w:tcPr>
             <w:tcW w:type="dxa" w:w="6624"/>
             <w:vAlign w:val="center"/>
-            <w:shd w:fill="F3F6FA"/>
+            <w:shd w:fill="FFFFFF"/>
           </w:tcPr>
           <w:p>
             <w:r/>
@@ -1146,7 +1192,7 @@
           <w:tcPr>
             <w:tcW w:type="dxa" w:w="2880"/>
             <w:vAlign w:val="center"/>
-            <w:shd w:fill="FFFFFF"/>
+            <w:shd w:fill="F3F6FA"/>
           </w:tcPr>
           <w:p>
             <w:r/>
@@ -1164,7 +1210,7 @@
           <w:tcPr>
             <w:tcW w:type="dxa" w:w="6624"/>
             <w:vAlign w:val="center"/>
-            <w:shd w:fill="FFFFFF"/>
+            <w:shd w:fill="F3F6FA"/>
           </w:tcPr>
           <w:p>
             <w:r/>
@@ -1184,7 +1230,7 @@
           <w:tcPr>
             <w:tcW w:type="dxa" w:w="2880"/>
             <w:vAlign w:val="center"/>
-            <w:shd w:fill="F3F6FA"/>
+            <w:shd w:fill="FFFFFF"/>
           </w:tcPr>
           <w:p>
             <w:r/>
@@ -1202,7 +1248,7 @@
           <w:tcPr>
             <w:tcW w:type="dxa" w:w="6624"/>
             <w:vAlign w:val="center"/>
-            <w:shd w:fill="F3F6FA"/>
+            <w:shd w:fill="FFFFFF"/>
           </w:tcPr>
           <w:p>
             <w:r/>
@@ -1222,7 +1268,7 @@
           <w:tcPr>
             <w:tcW w:type="dxa" w:w="2880"/>
             <w:vAlign w:val="center"/>
-            <w:shd w:fill="FFFFFF"/>
+            <w:shd w:fill="F3F6FA"/>
           </w:tcPr>
           <w:p>
             <w:r/>
@@ -1240,7 +1286,7 @@
           <w:tcPr>
             <w:tcW w:type="dxa" w:w="6624"/>
             <w:vAlign w:val="center"/>
-            <w:shd w:fill="FFFFFF"/>
+            <w:shd w:fill="F3F6FA"/>
           </w:tcPr>
           <w:p>
             <w:r/>
@@ -1260,7 +1306,7 @@
           <w:tcPr>
             <w:tcW w:type="dxa" w:w="2880"/>
             <w:vAlign w:val="center"/>
-            <w:shd w:fill="F3F6FA"/>
+            <w:shd w:fill="FFFFFF"/>
           </w:tcPr>
           <w:p>
             <w:r/>
@@ -1278,7 +1324,7 @@
           <w:tcPr>
             <w:tcW w:type="dxa" w:w="6624"/>
             <w:vAlign w:val="center"/>
-            <w:shd w:fill="F3F6FA"/>
+            <w:shd w:fill="FFFFFF"/>
           </w:tcPr>
           <w:p>
             <w:r/>
@@ -1298,7 +1344,7 @@
           <w:tcPr>
             <w:tcW w:type="dxa" w:w="2880"/>
             <w:vAlign w:val="center"/>
-            <w:shd w:fill="FFFFFF"/>
+            <w:shd w:fill="F3F6FA"/>
           </w:tcPr>
           <w:p>
             <w:r/>
@@ -1316,7 +1362,7 @@
           <w:tcPr>
             <w:tcW w:type="dxa" w:w="6624"/>
             <w:vAlign w:val="center"/>
-            <w:shd w:fill="FFFFFF"/>
+            <w:shd w:fill="F3F6FA"/>
           </w:tcPr>
           <w:p>
             <w:r/>
@@ -1498,7 +1544,7 @@
                 <w:b w:val="0"/>
                 <w:sz w:val="18"/>
               </w:rPr>
-              <w:t>TC-001, TC-003, TC-004, TC-006-TC-014</w:t>
+              <w:t>TC-001, TC-003, TC-004, TC-006-TC-014, TC-018-TC-019</w:t>
             </w:r>
           </w:p>
         </w:tc>
@@ -1592,7 +1638,7 @@
                 <w:b w:val="0"/>
                 <w:sz w:val="18"/>
               </w:rPr>
-              <w:t>Confirm authentication boundaries and logout</w:t>
+              <w:t>Confirm authentication boundaries, guest restrictions and logout</w:t>
             </w:r>
           </w:p>
         </w:tc>
@@ -1610,7 +1656,7 @@
                 <w:b w:val="0"/>
                 <w:sz w:val="18"/>
               </w:rPr>
-              <w:t>TC-015</w:t>
+              <w:t>TC-015, TC-020</w:t>
             </w:r>
           </w:p>
         </w:tc>
@@ -1666,7 +1712,7 @@
                 <w:b w:val="0"/>
                 <w:sz w:val="18"/>
               </w:rPr>
-              <w:t>TC-018: 25 tests, 62 assertions</w:t>
+              <w:t>TC-021: 26 tests, 65 assertions</w:t>
             </w:r>
           </w:p>
         </w:tc>
@@ -1704,7 +1750,7 @@
                 <w:b w:val="0"/>
                 <w:sz w:val="18"/>
               </w:rPr>
-              <w:t>Confirm usability, status badges, forms and navigation</w:t>
+              <w:t>Confirm usability, status badges, forms, guest report page and navigation</w:t>
             </w:r>
           </w:p>
         </w:tc>
@@ -1722,7 +1768,7 @@
                 <w:b w:val="0"/>
                 <w:sz w:val="18"/>
               </w:rPr>
-              <w:t>Figures A1-A5</w:t>
+              <w:t>Figures A1-A5 and Guest report UI</w:t>
             </w:r>
           </w:p>
         </w:tc>
@@ -2188,7 +2234,7 @@
                 <w:b w:val="0"/>
                 <w:sz w:val="18"/>
               </w:rPr>
-              <w:t>1 July 2026</w:t>
+              <w:t>9 July 2026</w:t>
             </w:r>
           </w:p>
         </w:tc>
@@ -2226,7 +2272,7 @@
                 <w:b w:val="0"/>
                 <w:sz w:val="18"/>
               </w:rPr>
-              <w:t>Administrator and maintenance staff accounts created for local validation</w:t>
+              <w:t>Administrator, receptionist, maintenance staff and unauthenticated guest flow</w:t>
             </w:r>
           </w:p>
         </w:tc>
@@ -2264,7 +2310,7 @@
                 <w:b w:val="0"/>
                 <w:sz w:val="18"/>
               </w:rPr>
-              <w:t>Seeded requests in Pending, In Progress and Completed states</w:t>
+              <w:t>Seeded requests in Pending, In Progress and Completed states, including guest-submitted reports</w:t>
             </w:r>
           </w:p>
         </w:tc>
@@ -2452,7 +2498,7 @@
                 <w:b w:val="0"/>
                 <w:sz w:val="18"/>
               </w:rPr>
-              <w:t>18</w:t>
+              <w:t>21</w:t>
             </w:r>
           </w:p>
         </w:tc>
@@ -2620,7 +2666,7 @@
                 <w:b w:val="0"/>
                 <w:sz w:val="18"/>
               </w:rPr>
-              <w:t>18</w:t>
+              <w:t>21</w:t>
             </w:r>
           </w:p>
         </w:tc>
@@ -2652,7 +2698,7 @@
           <w:b w:val="0"/>
           <w:sz w:val="22"/>
         </w:rPr>
-        <w:t>The automated regression suite separately completed 25 tests with 62 assertions and zero failures. Functional cases and automated cases are reported separately to avoid double-counting coverage.</w:t>
+        <w:t>The automated regression suite separately completed 26 tests with 65 assertions and zero failures. Functional cases and automated cases are reported separately to avoid double-counting coverage.</w:t>
       </w:r>
     </w:p>
     <w:p>
@@ -2812,7 +2858,7 @@
                 <w:b w:val="0"/>
                 <w:sz w:val="18"/>
               </w:rPr>
-              <w:t>TC-001, TC-002, TC-015, TC-016</w:t>
+              <w:t>TC-001, TC-002, TC-015, TC-016, TC-020</w:t>
             </w:r>
           </w:p>
         </w:tc>
@@ -2850,6 +2896,80 @@
                 <w:b w:val="0"/>
                 <w:sz w:val="18"/>
               </w:rPr>
+              <w:t>Guest damage reporting</w:t>
+            </w:r>
+          </w:p>
+        </w:tc>
+        <w:tc>
+          <w:tcPr>
+            <w:tcW w:type="dxa" w:w="3456"/>
+            <w:vAlign w:val="center"/>
+            <w:shd w:fill="FFFFFF"/>
+          </w:tcPr>
+          <w:p>
+            <w:r/>
+            <w:r>
+              <w:rPr>
+                <w:rFonts w:ascii="Arial" w:hAnsi="Arial"/>
+                <w:b w:val="0"/>
+                <w:sz w:val="18"/>
+              </w:rPr>
+              <w:t>Public guest report routes, image upload and nullable requester support</w:t>
+            </w:r>
+          </w:p>
+        </w:tc>
+        <w:tc>
+          <w:tcPr>
+            <w:tcW w:type="dxa" w:w="2304"/>
+            <w:vAlign w:val="center"/>
+            <w:shd w:fill="FFFFFF"/>
+          </w:tcPr>
+          <w:p>
+            <w:r/>
+            <w:r>
+              <w:rPr>
+                <w:rFonts w:ascii="Arial" w:hAnsi="Arial"/>
+                <w:b w:val="0"/>
+                <w:sz w:val="18"/>
+              </w:rPr>
+              <w:t>TC-018, TC-019, TC-020</w:t>
+            </w:r>
+          </w:p>
+        </w:tc>
+        <w:tc>
+          <w:tcPr>
+            <w:tcW w:type="dxa" w:w="1008"/>
+            <w:vAlign w:val="center"/>
+            <w:shd w:fill="FFFFFF"/>
+          </w:tcPr>
+          <w:p>
+            <w:r/>
+            <w:r>
+              <w:rPr>
+                <w:rFonts w:ascii="Arial" w:hAnsi="Arial"/>
+                <w:b w:val="0"/>
+                <w:sz w:val="18"/>
+              </w:rPr>
+              <w:t>Pass</w:t>
+            </w:r>
+          </w:p>
+        </w:tc>
+      </w:tr>
+      <w:tr>
+        <w:tc>
+          <w:tcPr>
+            <w:tcW w:type="dxa" w:w="2304"/>
+            <w:vAlign w:val="center"/>
+            <w:shd w:fill="F3F6FA"/>
+          </w:tcPr>
+          <w:p>
+            <w:r/>
+            <w:r>
+              <w:rPr>
+                <w:rFonts w:ascii="Arial" w:hAnsi="Arial"/>
+                <w:b w:val="0"/>
+                <w:sz w:val="18"/>
+              </w:rPr>
               <w:t>Operational overview</w:t>
             </w:r>
           </w:p>
@@ -2858,7 +2978,7 @@
           <w:tcPr>
             <w:tcW w:type="dxa" w:w="3456"/>
             <w:vAlign w:val="center"/>
-            <w:shd w:fill="FFFFFF"/>
+            <w:shd w:fill="F3F6FA"/>
           </w:tcPr>
           <w:p>
             <w:r/>
@@ -2876,7 +2996,7 @@
           <w:tcPr>
             <w:tcW w:type="dxa" w:w="2304"/>
             <w:vAlign w:val="center"/>
-            <w:shd w:fill="FFFFFF"/>
+            <w:shd w:fill="F3F6FA"/>
           </w:tcPr>
           <w:p>
             <w:r/>
@@ -2894,7 +3014,7 @@
           <w:tcPr>
             <w:tcW w:type="dxa" w:w="1008"/>
             <w:vAlign w:val="center"/>
-            <w:shd w:fill="FFFFFF"/>
+            <w:shd w:fill="F3F6FA"/>
           </w:tcPr>
           <w:p>
             <w:r/>
@@ -2914,7 +3034,7 @@
           <w:tcPr>
             <w:tcW w:type="dxa" w:w="2304"/>
             <w:vAlign w:val="center"/>
-            <w:shd w:fill="F3F6FA"/>
+            <w:shd w:fill="FFFFFF"/>
           </w:tcPr>
           <w:p>
             <w:r/>
@@ -2932,7 +3052,7 @@
           <w:tcPr>
             <w:tcW w:type="dxa" w:w="3456"/>
             <w:vAlign w:val="center"/>
-            <w:shd w:fill="F3F6FA"/>
+            <w:shd w:fill="FFFFFF"/>
           </w:tcPr>
           <w:p>
             <w:r/>
@@ -2950,7 +3070,7 @@
           <w:tcPr>
             <w:tcW w:type="dxa" w:w="2304"/>
             <w:vAlign w:val="center"/>
-            <w:shd w:fill="F3F6FA"/>
+            <w:shd w:fill="FFFFFF"/>
           </w:tcPr>
           <w:p>
             <w:r/>
@@ -2960,7 +3080,7 @@
                 <w:b w:val="0"/>
                 <w:sz w:val="18"/>
               </w:rPr>
-              <w:t>TC-004-TC-008, TC-017</w:t>
+              <w:t>TC-004-TC-008, TC-017, TC-019</w:t>
             </w:r>
           </w:p>
         </w:tc>
@@ -2968,7 +3088,7 @@
           <w:tcPr>
             <w:tcW w:type="dxa" w:w="1008"/>
             <w:vAlign w:val="center"/>
-            <w:shd w:fill="F3F6FA"/>
+            <w:shd w:fill="FFFFFF"/>
           </w:tcPr>
           <w:p>
             <w:r/>
@@ -2988,7 +3108,7 @@
           <w:tcPr>
             <w:tcW w:type="dxa" w:w="2304"/>
             <w:vAlign w:val="center"/>
-            <w:shd w:fill="FFFFFF"/>
+            <w:shd w:fill="F3F6FA"/>
           </w:tcPr>
           <w:p>
             <w:r/>
@@ -3006,7 +3126,7 @@
           <w:tcPr>
             <w:tcW w:type="dxa" w:w="3456"/>
             <w:vAlign w:val="center"/>
-            <w:shd w:fill="FFFFFF"/>
+            <w:shd w:fill="F3F6FA"/>
           </w:tcPr>
           <w:p>
             <w:r/>
@@ -3024,7 +3144,7 @@
           <w:tcPr>
             <w:tcW w:type="dxa" w:w="2304"/>
             <w:vAlign w:val="center"/>
-            <w:shd w:fill="FFFFFF"/>
+            <w:shd w:fill="F3F6FA"/>
           </w:tcPr>
           <w:p>
             <w:r/>
@@ -3042,7 +3162,7 @@
           <w:tcPr>
             <w:tcW w:type="dxa" w:w="1008"/>
             <w:vAlign w:val="center"/>
-            <w:shd w:fill="FFFFFF"/>
+            <w:shd w:fill="F3F6FA"/>
           </w:tcPr>
           <w:p>
             <w:r/>
@@ -3062,7 +3182,7 @@
           <w:tcPr>
             <w:tcW w:type="dxa" w:w="2304"/>
             <w:vAlign w:val="center"/>
-            <w:shd w:fill="F3F6FA"/>
+            <w:shd w:fill="FFFFFF"/>
           </w:tcPr>
           <w:p>
             <w:r/>
@@ -3080,7 +3200,7 @@
           <w:tcPr>
             <w:tcW w:type="dxa" w:w="3456"/>
             <w:vAlign w:val="center"/>
-            <w:shd w:fill="F3F6FA"/>
+            <w:shd w:fill="FFFFFF"/>
           </w:tcPr>
           <w:p>
             <w:r/>
@@ -3098,7 +3218,7 @@
           <w:tcPr>
             <w:tcW w:type="dxa" w:w="2304"/>
             <w:vAlign w:val="center"/>
-            <w:shd w:fill="F3F6FA"/>
+            <w:shd w:fill="FFFFFF"/>
           </w:tcPr>
           <w:p>
             <w:r/>
@@ -3116,7 +3236,7 @@
           <w:tcPr>
             <w:tcW w:type="dxa" w:w="1008"/>
             <w:vAlign w:val="center"/>
-            <w:shd w:fill="F3F6FA"/>
+            <w:shd w:fill="FFFFFF"/>
           </w:tcPr>
           <w:p>
             <w:r/>
@@ -3136,7 +3256,7 @@
           <w:tcPr>
             <w:tcW w:type="dxa" w:w="2304"/>
             <w:vAlign w:val="center"/>
-            <w:shd w:fill="FFFFFF"/>
+            <w:shd w:fill="F3F6FA"/>
           </w:tcPr>
           <w:p>
             <w:r/>
@@ -3154,7 +3274,7 @@
           <w:tcPr>
             <w:tcW w:type="dxa" w:w="3456"/>
             <w:vAlign w:val="center"/>
-            <w:shd w:fill="FFFFFF"/>
+            <w:shd w:fill="F3F6FA"/>
           </w:tcPr>
           <w:p>
             <w:r/>
@@ -3172,7 +3292,7 @@
           <w:tcPr>
             <w:tcW w:type="dxa" w:w="2304"/>
             <w:vAlign w:val="center"/>
-            <w:shd w:fill="FFFFFF"/>
+            <w:shd w:fill="F3F6FA"/>
           </w:tcPr>
           <w:p>
             <w:r/>
@@ -3182,7 +3302,7 @@
                 <w:b w:val="0"/>
                 <w:sz w:val="18"/>
               </w:rPr>
-              <w:t>TC-012, TC-013</w:t>
+              <w:t>TC-012, TC-013, TC-019</w:t>
             </w:r>
           </w:p>
         </w:tc>
@@ -3190,7 +3310,7 @@
           <w:tcPr>
             <w:tcW w:type="dxa" w:w="1008"/>
             <w:vAlign w:val="center"/>
-            <w:shd w:fill="FFFFFF"/>
+            <w:shd w:fill="F3F6FA"/>
           </w:tcPr>
           <w:p>
             <w:r/>
@@ -3210,7 +3330,7 @@
           <w:tcPr>
             <w:tcW w:type="dxa" w:w="2304"/>
             <w:vAlign w:val="center"/>
-            <w:shd w:fill="F3F6FA"/>
+            <w:shd w:fill="FFFFFF"/>
           </w:tcPr>
           <w:p>
             <w:r/>
@@ -3228,7 +3348,7 @@
           <w:tcPr>
             <w:tcW w:type="dxa" w:w="3456"/>
             <w:vAlign w:val="center"/>
-            <w:shd w:fill="F3F6FA"/>
+            <w:shd w:fill="FFFFFF"/>
           </w:tcPr>
           <w:p>
             <w:r/>
@@ -3246,7 +3366,7 @@
           <w:tcPr>
             <w:tcW w:type="dxa" w:w="2304"/>
             <w:vAlign w:val="center"/>
-            <w:shd w:fill="F3F6FA"/>
+            <w:shd w:fill="FFFFFF"/>
           </w:tcPr>
           <w:p>
             <w:r/>
@@ -3264,7 +3384,7 @@
           <w:tcPr>
             <w:tcW w:type="dxa" w:w="1008"/>
             <w:vAlign w:val="center"/>
-            <w:shd w:fill="F3F6FA"/>
+            <w:shd w:fill="FFFFFF"/>
           </w:tcPr>
           <w:p>
             <w:r/>
@@ -3284,7 +3404,7 @@
           <w:tcPr>
             <w:tcW w:type="dxa" w:w="2304"/>
             <w:vAlign w:val="center"/>
-            <w:shd w:fill="FFFFFF"/>
+            <w:shd w:fill="F3F6FA"/>
           </w:tcPr>
           <w:p>
             <w:r/>
@@ -3302,7 +3422,7 @@
           <w:tcPr>
             <w:tcW w:type="dxa" w:w="3456"/>
             <w:vAlign w:val="center"/>
-            <w:shd w:fill="FFFFFF"/>
+            <w:shd w:fill="F3F6FA"/>
           </w:tcPr>
           <w:p>
             <w:r/>
@@ -3320,7 +3440,7 @@
           <w:tcPr>
             <w:tcW w:type="dxa" w:w="2304"/>
             <w:vAlign w:val="center"/>
-            <w:shd w:fill="FFFFFF"/>
+            <w:shd w:fill="F3F6FA"/>
           </w:tcPr>
           <w:p>
             <w:r/>
@@ -3330,7 +3450,7 @@
                 <w:b w:val="0"/>
                 <w:sz w:val="18"/>
               </w:rPr>
-              <w:t>TC-018</w:t>
+              <w:t>TC-021</w:t>
             </w:r>
           </w:p>
         </w:tc>
@@ -3338,7 +3458,7 @@
           <w:tcPr>
             <w:tcW w:type="dxa" w:w="1008"/>
             <w:vAlign w:val="center"/>
-            <w:shd w:fill="FFFFFF"/>
+            <w:shd w:fill="F3F6FA"/>
           </w:tcPr>
           <w:p>
             <w:r/>
@@ -3670,7 +3790,7 @@
                 <w:b w:val="0"/>
                 <w:sz w:val="18"/>
               </w:rPr>
-              <w:t>2</w:t>
+              <w:t>4</w:t>
             </w:r>
           </w:p>
         </w:tc>
@@ -3744,7 +3864,7 @@
                 <w:b w:val="0"/>
                 <w:sz w:val="18"/>
               </w:rPr>
-              <w:t>3</w:t>
+              <w:t>5</w:t>
             </w:r>
           </w:p>
         </w:tc>
@@ -4163,6 +4283,190 @@
           </w:p>
         </w:tc>
       </w:tr>
+      <w:tr>
+        <w:tc>
+          <w:tcPr>
+            <w:tcW w:type="dxa" w:w="1152"/>
+            <w:vAlign w:val="center"/>
+            <w:shd w:fill="FFFFFF"/>
+          </w:tcPr>
+          <w:p>
+            <w:r/>
+            <w:r>
+              <w:rPr>
+                <w:rFonts w:ascii="Arial" w:hAnsi="Arial"/>
+                <w:b w:val="0"/>
+                <w:sz w:val="18"/>
+              </w:rPr>
+              <w:t>DF-004</w:t>
+            </w:r>
+          </w:p>
+        </w:tc>
+        <w:tc>
+          <w:tcPr>
+            <w:tcW w:type="dxa" w:w="2160"/>
+            <w:vAlign w:val="center"/>
+            <w:shd w:fill="FFFFFF"/>
+          </w:tcPr>
+          <w:p>
+            <w:r/>
+            <w:r>
+              <w:rPr>
+                <w:rFonts w:ascii="Arial" w:hAnsi="Arial"/>
+                <w:b w:val="0"/>
+                <w:sz w:val="18"/>
+              </w:rPr>
+              <w:t>Dashboard In Progress card appeared as a half-height progress bar</w:t>
+            </w:r>
+          </w:p>
+        </w:tc>
+        <w:tc>
+          <w:tcPr>
+            <w:tcW w:type="dxa" w:w="2016"/>
+            <w:vAlign w:val="center"/>
+            <w:shd w:fill="FFFFFF"/>
+          </w:tcPr>
+          <w:p>
+            <w:r/>
+            <w:r>
+              <w:rPr>
+                <w:rFonts w:ascii="Arial" w:hAnsi="Arial"/>
+                <w:b w:val="0"/>
+                <w:sz w:val="18"/>
+              </w:rPr>
+              <w:t>CSS class conflict with Bootstrap .progress</w:t>
+            </w:r>
+          </w:p>
+        </w:tc>
+        <w:tc>
+          <w:tcPr>
+            <w:tcW w:type="dxa" w:w="2448"/>
+            <w:vAlign w:val="center"/>
+            <w:shd w:fill="FFFFFF"/>
+          </w:tcPr>
+          <w:p>
+            <w:r/>
+            <w:r>
+              <w:rPr>
+                <w:rFonts w:ascii="Arial" w:hAnsi="Arial"/>
+                <w:b w:val="0"/>
+                <w:sz w:val="18"/>
+              </w:rPr>
+              <w:t>Card class was renamed to in-progress and matching CSS selectors were updated</w:t>
+            </w:r>
+          </w:p>
+        </w:tc>
+        <w:tc>
+          <w:tcPr>
+            <w:tcW w:type="dxa" w:w="1008"/>
+            <w:vAlign w:val="center"/>
+            <w:shd w:fill="FFFFFF"/>
+          </w:tcPr>
+          <w:p>
+            <w:r/>
+            <w:r>
+              <w:rPr>
+                <w:rFonts w:ascii="Arial" w:hAnsi="Arial"/>
+                <w:b w:val="0"/>
+                <w:sz w:val="18"/>
+              </w:rPr>
+              <w:t>Closed</w:t>
+            </w:r>
+          </w:p>
+        </w:tc>
+      </w:tr>
+      <w:tr>
+        <w:tc>
+          <w:tcPr>
+            <w:tcW w:type="dxa" w:w="1152"/>
+            <w:vAlign w:val="center"/>
+            <w:shd w:fill="F3F6FA"/>
+          </w:tcPr>
+          <w:p>
+            <w:r/>
+            <w:r>
+              <w:rPr>
+                <w:rFonts w:ascii="Arial" w:hAnsi="Arial"/>
+                <w:b w:val="0"/>
+                <w:sz w:val="18"/>
+              </w:rPr>
+              <w:t>DF-005</w:t>
+            </w:r>
+          </w:p>
+        </w:tc>
+        <w:tc>
+          <w:tcPr>
+            <w:tcW w:type="dxa" w:w="2160"/>
+            <w:vAlign w:val="center"/>
+            <w:shd w:fill="F3F6FA"/>
+          </w:tcPr>
+          <w:p>
+            <w:r/>
+            <w:r>
+              <w:rPr>
+                <w:rFonts w:ascii="Arial" w:hAnsi="Arial"/>
+                <w:b w:val="0"/>
+                <w:sz w:val="18"/>
+              </w:rPr>
+              <w:t>Guest request could not be saved without a user account</w:t>
+            </w:r>
+          </w:p>
+        </w:tc>
+        <w:tc>
+          <w:tcPr>
+            <w:tcW w:type="dxa" w:w="2016"/>
+            <w:vAlign w:val="center"/>
+            <w:shd w:fill="F3F6FA"/>
+          </w:tcPr>
+          <w:p>
+            <w:r/>
+            <w:r>
+              <w:rPr>
+                <w:rFonts w:ascii="Arial" w:hAnsi="Arial"/>
+                <w:b w:val="0"/>
+                <w:sz w:val="18"/>
+              </w:rPr>
+              <w:t>maintenance_requests.user_id was originally required</w:t>
+            </w:r>
+          </w:p>
+        </w:tc>
+        <w:tc>
+          <w:tcPr>
+            <w:tcW w:type="dxa" w:w="2448"/>
+            <w:vAlign w:val="center"/>
+            <w:shd w:fill="F3F6FA"/>
+          </w:tcPr>
+          <w:p>
+            <w:r/>
+            <w:r>
+              <w:rPr>
+                <w:rFonts w:ascii="Arial" w:hAnsi="Arial"/>
+                <w:b w:val="0"/>
+                <w:sz w:val="18"/>
+              </w:rPr>
+              <w:t>A migration changed user_id to nullable and guest reports are saved with pending status</w:t>
+            </w:r>
+          </w:p>
+        </w:tc>
+        <w:tc>
+          <w:tcPr>
+            <w:tcW w:type="dxa" w:w="1008"/>
+            <w:vAlign w:val="center"/>
+            <w:shd w:fill="F3F6FA"/>
+          </w:tcPr>
+          <w:p>
+            <w:r/>
+            <w:r>
+              <w:rPr>
+                <w:rFonts w:ascii="Arial" w:hAnsi="Arial"/>
+                <w:b w:val="0"/>
+                <w:sz w:val="18"/>
+              </w:rPr>
+              <w:t>Closed</w:t>
+            </w:r>
+          </w:p>
+        </w:tc>
+      </w:tr>
     </w:tbl>
     <w:p/>
     <w:p>
@@ -4280,7 +4584,7 @@
         <w:pStyle w:val="Heading2"/>
       </w:pPr>
       <w:r>
-        <w:t>8.4 Final Verification</w:t>
+        <w:t>8.4 Example: Guest Reporting Access</w:t>
       </w:r>
     </w:p>
     <w:p>
@@ -4290,7 +4594,25 @@
           <w:b w:val="0"/>
           <w:sz w:val="22"/>
         </w:rPr>
-        <w:t>The final regression execution reported 25 passed tests and 62 assertions. Live navigation produced successful pages for the dashboard, maintenance list, request detail, request creation form and notification centre. No blocking server or browser error was observed in the final evidence pass.</w:t>
+        <w:t>Symptom: the system originally required a logged-in user to create a maintenance request. The updated requirement introduced an unauthenticated Guest user who can report damage only. The solution added public guest routes, a Continue as Guest link on the login page, a styled guest report form, image upload support and a nullable user_id database change. Protected pages such as Dashboard and Maintenance remain behind authentication.</w:t>
+      </w:r>
+    </w:p>
+    <w:p>
+      <w:pPr>
+        <w:pStyle w:val="Heading2"/>
+      </w:pPr>
+      <w:r>
+        <w:t>8.5 Final Verification</w:t>
+      </w:r>
+    </w:p>
+    <w:p>
+      <w:r>
+        <w:rPr>
+          <w:rFonts w:ascii="Arial" w:hAnsi="Arial"/>
+          <w:b w:val="0"/>
+          <w:sz w:val="22"/>
+        </w:rPr>
+        <w:t>The final regression execution reported 26 passed tests and 65 assertions. Live navigation produced successful pages for the dashboard, maintenance list, request detail, request creation form, guest report form and notification centre. No blocking server or browser error was observed in the final evidence pass.</w:t>
       </w:r>
     </w:p>
     <w:p>
@@ -4308,7 +4630,7 @@
           <w:b w:val="0"/>
           <w:sz w:val="22"/>
         </w:rPr>
-        <w:t>The testing objectives were met. All 18 documented functional test cases passed, the automated suite passed 25 tests with 62 assertions, all in-scope requirements have traceable coverage, and no critical or major defect remains open. The system correctly supports the main hotel maintenance workflow from request submission through assignment, work progression, completion and notification.</w:t>
+        <w:t>The testing objectives were met. All 21 documented functional test cases passed, the automated suite passed 26 tests with 65 assertions, all in-scope requirements have traceable coverage, and no critical or major defect remains open. The system correctly supports the main hotel maintenance workflow from guest or authenticated request submission through administrator/receptionist review, staff assignment, work progression, completion and notification.</w:t>
       </w:r>
     </w:p>
     <w:tbl>
@@ -4606,7 +4928,7 @@
           <w:b w:val="0"/>
           <w:sz w:val="22"/>
         </w:rPr>
-        <w:t>Recommendation: proceed with the CSC2854 final project demonstration using the seeded administrator and staff test accounts. Retain the accompanying workbook as the primary step-by-step test case record.</w:t>
+        <w:t>Recommendation: proceed with the CSC2854 final project demonstration using the seeded administrator, receptionist and staff test accounts plus the unauthenticated guest reporting flow. Retain the accompanying workbook as the primary step-by-step test case record.</w:t>
       </w:r>
     </w:p>
     <w:p>
@@ -4902,7 +5224,7 @@
           <w:b w:val="0"/>
           <w:sz w:val="22"/>
         </w:rPr>
-        <w:t>The complete test case register is supplied as HMMS_FULL_TEST_CASES.xlsx. It contains a summary worksheet and 18 individual test case worksheets. Every worksheet records prerequisites, test data, three execution steps, expected results, actual results and final status.</w:t>
+        <w:t>The complete test case register is supplied as HMMS_FULL_TEST_CASES.xlsx. It contains a summary worksheet and 21 individual test case worksheets. Every worksheet records prerequisites, test data, three execution steps, expected results, actual results and final status.</w:t>
       </w:r>
     </w:p>
     <w:tbl>
@@ -4996,7 +5318,7 @@
                 <w:b w:val="0"/>
                 <w:sz w:val="18"/>
               </w:rPr>
-              <w:t>18 cases, module mapping, status and evidence reference</w:t>
+              <w:t>21 cases, module mapping, status and evidence reference</w:t>
             </w:r>
           </w:p>
         </w:tc>
@@ -5320,7 +5642,7 @@
                 <w:b w:val="0"/>
                 <w:sz w:val="18"/>
               </w:rPr>
-              <w:t>TC-018</w:t>
+              <w:t>TC-018 to TC-020</w:t>
             </w:r>
           </w:p>
         </w:tc>
@@ -5329,6 +5651,44 @@
             <w:tcW w:type="dxa" w:w="6192"/>
             <w:vAlign w:val="center"/>
             <w:shd w:fill="FFFFFF"/>
+          </w:tcPr>
+          <w:p>
+            <w:r/>
+            <w:r>
+              <w:rPr>
+                <w:rFonts w:ascii="Arial" w:hAnsi="Arial"/>
+                <w:b w:val="0"/>
+                <w:sz w:val="18"/>
+              </w:rPr>
+              <w:t>Guest access, guest report submission and guest access restriction</w:t>
+            </w:r>
+          </w:p>
+        </w:tc>
+      </w:tr>
+      <w:tr>
+        <w:tc>
+          <w:tcPr>
+            <w:tcW w:type="dxa" w:w="3024"/>
+            <w:vAlign w:val="center"/>
+            <w:shd w:fill="F3F6FA"/>
+          </w:tcPr>
+          <w:p>
+            <w:r/>
+            <w:r>
+              <w:rPr>
+                <w:rFonts w:ascii="Arial" w:hAnsi="Arial"/>
+                <w:b w:val="0"/>
+                <w:sz w:val="18"/>
+              </w:rPr>
+              <w:t>TC-021</w:t>
+            </w:r>
+          </w:p>
+        </w:tc>
+        <w:tc>
+          <w:tcPr>
+            <w:tcW w:type="dxa" w:w="6192"/>
+            <w:vAlign w:val="center"/>
+            <w:shd w:fill="F3F6FA"/>
           </w:tcPr>
           <w:p>
             <w:r/>
@@ -6002,7 +6362,7 @@
                 <w:b w:val="0"/>
                 <w:sz w:val="16"/>
               </w:rPr>
-              <w:t>Sections 2 and 6; Appendix B; TC-001 to TC-018</w:t>
+              <w:t>Sections 2 and 6; Appendix B; TC-001 to TC-021</w:t>
             </w:r>
           </w:p>
         </w:tc>
@@ -6560,7 +6920,7 @@
                 <w:b w:val="0"/>
                 <w:sz w:val="16"/>
               </w:rPr>
-              <w:t>Appendix D contains all 18 detailed test cases</w:t>
+              <w:t>Appendix D contains all 21 detailed test cases</w:t>
             </w:r>
           </w:p>
         </w:tc>
@@ -6690,7 +7050,7 @@
           <w:rFonts w:ascii="Arial" w:hAnsi="Arial"/>
           <w:sz w:val="22"/>
         </w:rPr>
-        <w:t>•  System testing evidence through 18 documented functional cases and an automated regression suite.</w:t>
+        <w:t>•  System testing evidence through 21 documented functional cases and an automated regression suite.</w:t>
       </w:r>
     </w:p>
     <w:p>
@@ -22251,7 +22611,7 @@
         <w:keepNext/>
       </w:pPr>
       <w:r>
-        <w:t>TC-018: Automated regression suite</w:t>
+        <w:t>TC-018: Continue as Guest from login page</w:t>
       </w:r>
     </w:p>
     <w:tbl>
@@ -22534,7 +22894,7 @@
                 <w:b w:val="0"/>
                 <w:sz w:val="17"/>
               </w:rPr>
-              <w:t>Automated regression suite</w:t>
+              <w:t>Continue as Guest from login page</w:t>
             </w:r>
           </w:p>
         </w:tc>
@@ -22666,7 +23026,7 @@
                 <w:b w:val="0"/>
                 <w:sz w:val="17"/>
               </w:rPr>
-              <w:t>PHPUnit feature and unit tests</w:t>
+              <w:t>Unauthenticated browser session</w:t>
             </w:r>
           </w:p>
         </w:tc>
@@ -22850,6 +23210,2742 @@
                 <w:b w:val="0"/>
                 <w:sz w:val="16"/>
               </w:rPr>
+              <w:t>Open the login page</w:t>
+            </w:r>
+          </w:p>
+        </w:tc>
+        <w:tc>
+          <w:tcPr>
+            <w:tcW w:type="dxa" w:w="2736"/>
+            <w:vAlign w:val="center"/>
+            <w:shd w:fill="FFFFFF"/>
+          </w:tcPr>
+          <w:p>
+            <w:pPr>
+              <w:spacing w:after="0"/>
+            </w:pPr>
+            <w:r/>
+            <w:r>
+              <w:rPr>
+                <w:rFonts w:ascii="Arial" w:hAnsi="Arial"/>
+                <w:b w:val="0"/>
+                <w:sz w:val="16"/>
+              </w:rPr>
+              <w:t>Login page is displayed</w:t>
+            </w:r>
+          </w:p>
+        </w:tc>
+        <w:tc>
+          <w:tcPr>
+            <w:tcW w:type="dxa" w:w="1872"/>
+            <w:vAlign w:val="center"/>
+            <w:shd w:fill="FFFFFF"/>
+          </w:tcPr>
+          <w:p>
+            <w:pPr>
+              <w:spacing w:after="0"/>
+            </w:pPr>
+            <w:r/>
+            <w:r>
+              <w:rPr>
+                <w:rFonts w:ascii="Arial" w:hAnsi="Arial"/>
+                <w:b w:val="0"/>
+                <w:sz w:val="16"/>
+              </w:rPr>
+              <w:t>As expected</w:t>
+            </w:r>
+          </w:p>
+        </w:tc>
+        <w:tc>
+          <w:tcPr>
+            <w:tcW w:type="dxa" w:w="1008"/>
+            <w:vAlign w:val="center"/>
+            <w:shd w:fill="FFFFFF"/>
+          </w:tcPr>
+          <w:p>
+            <w:pPr>
+              <w:spacing w:after="0"/>
+            </w:pPr>
+            <w:r/>
+            <w:r>
+              <w:rPr>
+                <w:rFonts w:ascii="Arial" w:hAnsi="Arial"/>
+                <w:b w:val="0"/>
+                <w:sz w:val="16"/>
+              </w:rPr>
+              <w:t>Pass</w:t>
+            </w:r>
+          </w:p>
+        </w:tc>
+      </w:tr>
+      <w:tr>
+        <w:tc>
+          <w:tcPr>
+            <w:tcW w:type="dxa" w:w="648"/>
+            <w:vAlign w:val="center"/>
+            <w:shd w:fill="F3F6FA"/>
+          </w:tcPr>
+          <w:p>
+            <w:pPr>
+              <w:spacing w:after="0"/>
+            </w:pPr>
+            <w:r/>
+            <w:r>
+              <w:rPr>
+                <w:rFonts w:ascii="Arial" w:hAnsi="Arial"/>
+                <w:b w:val="0"/>
+                <w:sz w:val="16"/>
+              </w:rPr>
+              <w:t>2</w:t>
+            </w:r>
+          </w:p>
+        </w:tc>
+        <w:tc>
+          <w:tcPr>
+            <w:tcW w:type="dxa" w:w="2664"/>
+            <w:vAlign w:val="center"/>
+            <w:shd w:fill="F3F6FA"/>
+          </w:tcPr>
+          <w:p>
+            <w:pPr>
+              <w:spacing w:after="0"/>
+            </w:pPr>
+            <w:r/>
+            <w:r>
+              <w:rPr>
+                <w:rFonts w:ascii="Arial" w:hAnsi="Arial"/>
+                <w:b w:val="0"/>
+                <w:sz w:val="16"/>
+              </w:rPr>
+              <w:t>Select Continue as Guest</w:t>
+            </w:r>
+          </w:p>
+        </w:tc>
+        <w:tc>
+          <w:tcPr>
+            <w:tcW w:type="dxa" w:w="2736"/>
+            <w:vAlign w:val="center"/>
+            <w:shd w:fill="F3F6FA"/>
+          </w:tcPr>
+          <w:p>
+            <w:pPr>
+              <w:spacing w:after="0"/>
+            </w:pPr>
+            <w:r/>
+            <w:r>
+              <w:rPr>
+                <w:rFonts w:ascii="Arial" w:hAnsi="Arial"/>
+                <w:b w:val="0"/>
+                <w:sz w:val="16"/>
+              </w:rPr>
+              <w:t>Guest option is visible and clickable</w:t>
+            </w:r>
+          </w:p>
+        </w:tc>
+        <w:tc>
+          <w:tcPr>
+            <w:tcW w:type="dxa" w:w="1872"/>
+            <w:vAlign w:val="center"/>
+            <w:shd w:fill="F3F6FA"/>
+          </w:tcPr>
+          <w:p>
+            <w:pPr>
+              <w:spacing w:after="0"/>
+            </w:pPr>
+            <w:r/>
+            <w:r>
+              <w:rPr>
+                <w:rFonts w:ascii="Arial" w:hAnsi="Arial"/>
+                <w:b w:val="0"/>
+                <w:sz w:val="16"/>
+              </w:rPr>
+              <w:t>As expected</w:t>
+            </w:r>
+          </w:p>
+        </w:tc>
+        <w:tc>
+          <w:tcPr>
+            <w:tcW w:type="dxa" w:w="1008"/>
+            <w:vAlign w:val="center"/>
+            <w:shd w:fill="F3F6FA"/>
+          </w:tcPr>
+          <w:p>
+            <w:pPr>
+              <w:spacing w:after="0"/>
+            </w:pPr>
+            <w:r/>
+            <w:r>
+              <w:rPr>
+                <w:rFonts w:ascii="Arial" w:hAnsi="Arial"/>
+                <w:b w:val="0"/>
+                <w:sz w:val="16"/>
+              </w:rPr>
+              <w:t>Pass</w:t>
+            </w:r>
+          </w:p>
+        </w:tc>
+      </w:tr>
+      <w:tr>
+        <w:tc>
+          <w:tcPr>
+            <w:tcW w:type="dxa" w:w="648"/>
+            <w:vAlign w:val="center"/>
+            <w:shd w:fill="FFFFFF"/>
+          </w:tcPr>
+          <w:p>
+            <w:pPr>
+              <w:spacing w:after="0"/>
+            </w:pPr>
+            <w:r/>
+            <w:r>
+              <w:rPr>
+                <w:rFonts w:ascii="Arial" w:hAnsi="Arial"/>
+                <w:b w:val="0"/>
+                <w:sz w:val="16"/>
+              </w:rPr>
+              <w:t>3</w:t>
+            </w:r>
+          </w:p>
+        </w:tc>
+        <w:tc>
+          <w:tcPr>
+            <w:tcW w:type="dxa" w:w="2664"/>
+            <w:vAlign w:val="center"/>
+            <w:shd w:fill="FFFFFF"/>
+          </w:tcPr>
+          <w:p>
+            <w:pPr>
+              <w:spacing w:after="0"/>
+            </w:pPr>
+            <w:r/>
+            <w:r>
+              <w:rPr>
+                <w:rFonts w:ascii="Arial" w:hAnsi="Arial"/>
+                <w:b w:val="0"/>
+                <w:sz w:val="16"/>
+              </w:rPr>
+              <w:t>Observe the guest report page</w:t>
+            </w:r>
+          </w:p>
+        </w:tc>
+        <w:tc>
+          <w:tcPr>
+            <w:tcW w:type="dxa" w:w="2736"/>
+            <w:vAlign w:val="center"/>
+            <w:shd w:fill="FFFFFF"/>
+          </w:tcPr>
+          <w:p>
+            <w:pPr>
+              <w:spacing w:after="0"/>
+            </w:pPr>
+            <w:r/>
+            <w:r>
+              <w:rPr>
+                <w:rFonts w:ascii="Arial" w:hAnsi="Arial"/>
+                <w:b w:val="0"/>
+                <w:sz w:val="16"/>
+              </w:rPr>
+              <w:t>Guest Maintenance Report page opens without authentication</w:t>
+            </w:r>
+          </w:p>
+        </w:tc>
+        <w:tc>
+          <w:tcPr>
+            <w:tcW w:type="dxa" w:w="1872"/>
+            <w:vAlign w:val="center"/>
+            <w:shd w:fill="FFFFFF"/>
+          </w:tcPr>
+          <w:p>
+            <w:pPr>
+              <w:spacing w:after="0"/>
+            </w:pPr>
+            <w:r/>
+            <w:r>
+              <w:rPr>
+                <w:rFonts w:ascii="Arial" w:hAnsi="Arial"/>
+                <w:b w:val="0"/>
+                <w:sz w:val="16"/>
+              </w:rPr>
+              <w:t>As expected</w:t>
+            </w:r>
+          </w:p>
+        </w:tc>
+        <w:tc>
+          <w:tcPr>
+            <w:tcW w:type="dxa" w:w="1008"/>
+            <w:vAlign w:val="center"/>
+            <w:shd w:fill="FFFFFF"/>
+          </w:tcPr>
+          <w:p>
+            <w:pPr>
+              <w:spacing w:after="0"/>
+            </w:pPr>
+            <w:r/>
+            <w:r>
+              <w:rPr>
+                <w:rFonts w:ascii="Arial" w:hAnsi="Arial"/>
+                <w:b w:val="0"/>
+                <w:sz w:val="16"/>
+              </w:rPr>
+              <w:t>Pass</w:t>
+            </w:r>
+          </w:p>
+        </w:tc>
+      </w:tr>
+    </w:tbl>
+    <w:p>
+      <w:pPr>
+        <w:spacing w:after="40"/>
+      </w:pPr>
+    </w:p>
+    <w:p>
+      <w:pPr>
+        <w:spacing w:before="60"/>
+      </w:pPr>
+      <w:r>
+        <w:rPr>
+          <w:rFonts w:ascii="Arial" w:hAnsi="Arial"/>
+          <w:b/>
+          <w:color w:val="006100"/>
+          <w:sz w:val="20"/>
+        </w:rPr>
+        <w:t>Result: PASS - All expected outcomes were achieved.</w:t>
+      </w:r>
+    </w:p>
+    <w:p>
+      <w:r>
+        <w:br w:type="page"/>
+      </w:r>
+    </w:p>
+    <w:p>
+      <w:pPr>
+        <w:pStyle w:val="Heading2"/>
+        <w:keepNext/>
+      </w:pPr>
+      <w:r>
+        <w:t>TC-019: Submit guest maintenance report with image</w:t>
+      </w:r>
+    </w:p>
+    <w:tbl>
+      <w:tblPr>
+        <w:tblW w:type="auto" w:w="0"/>
+        <w:jc w:val="center"/>
+        <w:tblLayout w:type="fixed"/>
+        <w:tblLook w:firstColumn="1" w:firstRow="1" w:lastColumn="0" w:lastRow="0" w:noHBand="0" w:noVBand="1" w:val="04A0"/>
+        <w:tblBorders>
+          <w:top w:val="single" w:sz="4" w:color="B4C6E7"/>
+          <w:left w:val="single" w:sz="4" w:color="B4C6E7"/>
+          <w:bottom w:val="single" w:sz="4" w:color="B4C6E7"/>
+          <w:right w:val="single" w:sz="4" w:color="B4C6E7"/>
+          <w:insideH w:val="single" w:sz="4" w:color="B4C6E7"/>
+          <w:insideV w:val="single" w:sz="4" w:color="B4C6E7"/>
+        </w:tblBorders>
+      </w:tblPr>
+      <w:tblGrid>
+        <w:gridCol w:w="4968"/>
+        <w:gridCol w:w="4968"/>
+      </w:tblGrid>
+      <w:tr>
+        <w:tc>
+          <w:tcPr>
+            <w:tcW w:type="dxa" w:w="2232"/>
+            <w:vAlign w:val="center"/>
+            <w:shd w:fill="4472C4"/>
+          </w:tcPr>
+          <w:p>
+            <w:pPr>
+              <w:spacing w:after="0"/>
+            </w:pPr>
+            <w:r/>
+            <w:r>
+              <w:rPr>
+                <w:rFonts w:ascii="Arial" w:hAnsi="Arial"/>
+                <w:b/>
+                <w:color w:val="FFFFFF"/>
+                <w:sz w:val="17"/>
+              </w:rPr>
+              <w:t>Field</w:t>
+            </w:r>
+          </w:p>
+        </w:tc>
+        <w:tc>
+          <w:tcPr>
+            <w:tcW w:type="dxa" w:w="6984"/>
+            <w:vAlign w:val="center"/>
+            <w:shd w:fill="4472C4"/>
+          </w:tcPr>
+          <w:p>
+            <w:pPr>
+              <w:spacing w:after="0"/>
+            </w:pPr>
+            <w:r/>
+            <w:r>
+              <w:rPr>
+                <w:rFonts w:ascii="Arial" w:hAnsi="Arial"/>
+                <w:b/>
+                <w:color w:val="FFFFFF"/>
+                <w:sz w:val="17"/>
+              </w:rPr>
+              <w:t>Details</w:t>
+            </w:r>
+          </w:p>
+        </w:tc>
+      </w:tr>
+      <w:tr>
+        <w:tc>
+          <w:tcPr>
+            <w:tcW w:type="dxa" w:w="2232"/>
+            <w:vAlign w:val="center"/>
+            <w:shd w:fill="FFFFFF"/>
+          </w:tcPr>
+          <w:p>
+            <w:pPr>
+              <w:spacing w:after="0"/>
+            </w:pPr>
+            <w:r/>
+            <w:r>
+              <w:rPr>
+                <w:rFonts w:ascii="Arial" w:hAnsi="Arial"/>
+                <w:b w:val="0"/>
+                <w:sz w:val="17"/>
+              </w:rPr>
+              <w:t>Test Case ID</w:t>
+            </w:r>
+          </w:p>
+        </w:tc>
+        <w:tc>
+          <w:tcPr>
+            <w:tcW w:type="dxa" w:w="6984"/>
+            <w:vAlign w:val="center"/>
+            <w:shd w:fill="FFFFFF"/>
+          </w:tcPr>
+          <w:p>
+            <w:pPr>
+              <w:spacing w:after="0"/>
+            </w:pPr>
+            <w:r/>
+            <w:r>
+              <w:rPr>
+                <w:rFonts w:ascii="Arial" w:hAnsi="Arial"/>
+                <w:b w:val="0"/>
+                <w:sz w:val="17"/>
+              </w:rPr>
+              <w:t>TC-019</w:t>
+            </w:r>
+          </w:p>
+        </w:tc>
+      </w:tr>
+      <w:tr>
+        <w:tc>
+          <w:tcPr>
+            <w:tcW w:type="dxa" w:w="2232"/>
+            <w:vAlign w:val="center"/>
+            <w:shd w:fill="F3F6FA"/>
+          </w:tcPr>
+          <w:p>
+            <w:pPr>
+              <w:spacing w:after="0"/>
+            </w:pPr>
+            <w:r/>
+            <w:r>
+              <w:rPr>
+                <w:rFonts w:ascii="Arial" w:hAnsi="Arial"/>
+                <w:b w:val="0"/>
+                <w:sz w:val="17"/>
+              </w:rPr>
+              <w:t>Version</w:t>
+            </w:r>
+          </w:p>
+        </w:tc>
+        <w:tc>
+          <w:tcPr>
+            <w:tcW w:type="dxa" w:w="6984"/>
+            <w:vAlign w:val="center"/>
+            <w:shd w:fill="F3F6FA"/>
+          </w:tcPr>
+          <w:p>
+            <w:pPr>
+              <w:spacing w:after="0"/>
+            </w:pPr>
+            <w:r/>
+            <w:r>
+              <w:rPr>
+                <w:rFonts w:ascii="Arial" w:hAnsi="Arial"/>
+                <w:b w:val="0"/>
+                <w:sz w:val="17"/>
+              </w:rPr>
+              <w:t>1.0</w:t>
+            </w:r>
+          </w:p>
+        </w:tc>
+      </w:tr>
+      <w:tr>
+        <w:tc>
+          <w:tcPr>
+            <w:tcW w:type="dxa" w:w="2232"/>
+            <w:vAlign w:val="center"/>
+            <w:shd w:fill="FFFFFF"/>
+          </w:tcPr>
+          <w:p>
+            <w:pPr>
+              <w:spacing w:after="0"/>
+            </w:pPr>
+            <w:r/>
+            <w:r>
+              <w:rPr>
+                <w:rFonts w:ascii="Arial" w:hAnsi="Arial"/>
+                <w:b w:val="0"/>
+                <w:sz w:val="17"/>
+              </w:rPr>
+              <w:t>Date Tested</w:t>
+            </w:r>
+          </w:p>
+        </w:tc>
+        <w:tc>
+          <w:tcPr>
+            <w:tcW w:type="dxa" w:w="6984"/>
+            <w:vAlign w:val="center"/>
+            <w:shd w:fill="FFFFFF"/>
+          </w:tcPr>
+          <w:p>
+            <w:pPr>
+              <w:spacing w:after="0"/>
+            </w:pPr>
+            <w:r/>
+            <w:r>
+              <w:rPr>
+                <w:rFonts w:ascii="Arial" w:hAnsi="Arial"/>
+                <w:b w:val="0"/>
+                <w:sz w:val="17"/>
+              </w:rPr>
+              <w:t>01 July 2026</w:t>
+            </w:r>
+          </w:p>
+        </w:tc>
+      </w:tr>
+      <w:tr>
+        <w:tc>
+          <w:tcPr>
+            <w:tcW w:type="dxa" w:w="2232"/>
+            <w:vAlign w:val="center"/>
+            <w:shd w:fill="F3F6FA"/>
+          </w:tcPr>
+          <w:p>
+            <w:pPr>
+              <w:spacing w:after="0"/>
+            </w:pPr>
+            <w:r/>
+            <w:r>
+              <w:rPr>
+                <w:rFonts w:ascii="Arial" w:hAnsi="Arial"/>
+                <w:b w:val="0"/>
+                <w:sz w:val="17"/>
+              </w:rPr>
+              <w:t>Final Status</w:t>
+            </w:r>
+          </w:p>
+        </w:tc>
+        <w:tc>
+          <w:tcPr>
+            <w:tcW w:type="dxa" w:w="6984"/>
+            <w:vAlign w:val="center"/>
+            <w:shd w:fill="F3F6FA"/>
+          </w:tcPr>
+          <w:p>
+            <w:pPr>
+              <w:spacing w:after="0"/>
+            </w:pPr>
+            <w:r/>
+            <w:r>
+              <w:rPr>
+                <w:rFonts w:ascii="Arial" w:hAnsi="Arial"/>
+                <w:b w:val="0"/>
+                <w:sz w:val="17"/>
+              </w:rPr>
+              <w:t>Pass</w:t>
+            </w:r>
+          </w:p>
+        </w:tc>
+      </w:tr>
+      <w:tr>
+        <w:tc>
+          <w:tcPr>
+            <w:tcW w:type="dxa" w:w="2232"/>
+            <w:vAlign w:val="center"/>
+            <w:shd w:fill="FFFFFF"/>
+          </w:tcPr>
+          <w:p>
+            <w:pPr>
+              <w:spacing w:after="0"/>
+            </w:pPr>
+            <w:r/>
+            <w:r>
+              <w:rPr>
+                <w:rFonts w:ascii="Arial" w:hAnsi="Arial"/>
+                <w:b w:val="0"/>
+                <w:sz w:val="17"/>
+              </w:rPr>
+              <w:t>Test Scenario</w:t>
+            </w:r>
+          </w:p>
+        </w:tc>
+        <w:tc>
+          <w:tcPr>
+            <w:tcW w:type="dxa" w:w="6984"/>
+            <w:vAlign w:val="center"/>
+            <w:shd w:fill="FFFFFF"/>
+          </w:tcPr>
+          <w:p>
+            <w:pPr>
+              <w:spacing w:after="0"/>
+            </w:pPr>
+            <w:r/>
+            <w:r>
+              <w:rPr>
+                <w:rFonts w:ascii="Arial" w:hAnsi="Arial"/>
+                <w:b w:val="0"/>
+                <w:sz w:val="17"/>
+              </w:rPr>
+              <w:t>Submit guest maintenance report with image</w:t>
+            </w:r>
+          </w:p>
+        </w:tc>
+      </w:tr>
+      <w:tr>
+        <w:tc>
+          <w:tcPr>
+            <w:tcW w:type="dxa" w:w="2232"/>
+            <w:vAlign w:val="center"/>
+            <w:shd w:fill="F3F6FA"/>
+          </w:tcPr>
+          <w:p>
+            <w:pPr>
+              <w:spacing w:after="0"/>
+            </w:pPr>
+            <w:r/>
+            <w:r>
+              <w:rPr>
+                <w:rFonts w:ascii="Arial" w:hAnsi="Arial"/>
+                <w:b w:val="0"/>
+                <w:sz w:val="17"/>
+              </w:rPr>
+              <w:t>Prerequisite 1</w:t>
+            </w:r>
+          </w:p>
+        </w:tc>
+        <w:tc>
+          <w:tcPr>
+            <w:tcW w:type="dxa" w:w="6984"/>
+            <w:vAlign w:val="center"/>
+            <w:shd w:fill="F3F6FA"/>
+          </w:tcPr>
+          <w:p>
+            <w:pPr>
+              <w:spacing w:after="0"/>
+            </w:pPr>
+            <w:r/>
+            <w:r>
+              <w:rPr>
+                <w:rFonts w:ascii="Arial" w:hAnsi="Arial"/>
+                <w:b w:val="0"/>
+                <w:sz w:val="17"/>
+              </w:rPr>
+              <w:t>Application running at http://127.0.0.1:8000</w:t>
+            </w:r>
+          </w:p>
+        </w:tc>
+      </w:tr>
+      <w:tr>
+        <w:tc>
+          <w:tcPr>
+            <w:tcW w:type="dxa" w:w="2232"/>
+            <w:vAlign w:val="center"/>
+            <w:shd w:fill="FFFFFF"/>
+          </w:tcPr>
+          <w:p>
+            <w:pPr>
+              <w:spacing w:after="0"/>
+            </w:pPr>
+            <w:r/>
+            <w:r>
+              <w:rPr>
+                <w:rFonts w:ascii="Arial" w:hAnsi="Arial"/>
+                <w:b w:val="0"/>
+                <w:sz w:val="17"/>
+              </w:rPr>
+              <w:t>Prerequisite 2</w:t>
+            </w:r>
+          </w:p>
+        </w:tc>
+        <w:tc>
+          <w:tcPr>
+            <w:tcW w:type="dxa" w:w="6984"/>
+            <w:vAlign w:val="center"/>
+            <w:shd w:fill="FFFFFF"/>
+          </w:tcPr>
+          <w:p>
+            <w:pPr>
+              <w:spacing w:after="0"/>
+            </w:pPr>
+            <w:r/>
+            <w:r>
+              <w:rPr>
+                <w:rFonts w:ascii="Arial" w:hAnsi="Arial"/>
+                <w:b w:val="0"/>
+                <w:sz w:val="17"/>
+              </w:rPr>
+              <w:t>Supported browser and appropriate test account</w:t>
+            </w:r>
+          </w:p>
+        </w:tc>
+      </w:tr>
+      <w:tr>
+        <w:tc>
+          <w:tcPr>
+            <w:tcW w:type="dxa" w:w="2232"/>
+            <w:vAlign w:val="center"/>
+            <w:shd w:fill="F3F6FA"/>
+          </w:tcPr>
+          <w:p>
+            <w:pPr>
+              <w:spacing w:after="0"/>
+            </w:pPr>
+            <w:r/>
+            <w:r>
+              <w:rPr>
+                <w:rFonts w:ascii="Arial" w:hAnsi="Arial"/>
+                <w:b w:val="0"/>
+                <w:sz w:val="17"/>
+              </w:rPr>
+              <w:t>Test Data</w:t>
+            </w:r>
+          </w:p>
+        </w:tc>
+        <w:tc>
+          <w:tcPr>
+            <w:tcW w:type="dxa" w:w="6984"/>
+            <w:vAlign w:val="center"/>
+            <w:shd w:fill="F3F6FA"/>
+          </w:tcPr>
+          <w:p>
+            <w:pPr>
+              <w:spacing w:after="0"/>
+            </w:pPr>
+            <w:r/>
+            <w:r>
+              <w:rPr>
+                <w:rFonts w:ascii="Arial" w:hAnsi="Arial"/>
+                <w:b w:val="0"/>
+                <w:sz w:val="17"/>
+              </w:rPr>
+              <w:t>Problem title, location, urgency, description and optional image</w:t>
+            </w:r>
+          </w:p>
+        </w:tc>
+      </w:tr>
+    </w:tbl>
+    <w:p>
+      <w:pPr>
+        <w:spacing w:after="40"/>
+      </w:pPr>
+    </w:p>
+    <w:tbl>
+      <w:tblPr>
+        <w:tblW w:type="auto" w:w="0"/>
+        <w:jc w:val="center"/>
+        <w:tblLayout w:type="fixed"/>
+        <w:tblLook w:firstColumn="1" w:firstRow="1" w:lastColumn="0" w:lastRow="0" w:noHBand="0" w:noVBand="1" w:val="04A0"/>
+        <w:tblBorders>
+          <w:top w:val="single" w:sz="4" w:color="B4C6E7"/>
+          <w:left w:val="single" w:sz="4" w:color="B4C6E7"/>
+          <w:bottom w:val="single" w:sz="4" w:color="B4C6E7"/>
+          <w:right w:val="single" w:sz="4" w:color="B4C6E7"/>
+          <w:insideH w:val="single" w:sz="4" w:color="B4C6E7"/>
+          <w:insideV w:val="single" w:sz="4" w:color="B4C6E7"/>
+        </w:tblBorders>
+      </w:tblPr>
+      <w:tblGrid>
+        <w:gridCol w:w="1987"/>
+        <w:gridCol w:w="1987"/>
+        <w:gridCol w:w="1987"/>
+        <w:gridCol w:w="1987"/>
+        <w:gridCol w:w="1987"/>
+      </w:tblGrid>
+      <w:tr>
+        <w:tc>
+          <w:tcPr>
+            <w:tcW w:type="dxa" w:w="648"/>
+            <w:vAlign w:val="center"/>
+            <w:shd w:fill="4472C4"/>
+          </w:tcPr>
+          <w:p>
+            <w:pPr>
+              <w:spacing w:after="0"/>
+            </w:pPr>
+            <w:r/>
+            <w:r>
+              <w:rPr>
+                <w:rFonts w:ascii="Arial" w:hAnsi="Arial"/>
+                <w:b/>
+                <w:color w:val="FFFFFF"/>
+                <w:sz w:val="16"/>
+              </w:rPr>
+              <w:t>Step</w:t>
+            </w:r>
+          </w:p>
+        </w:tc>
+        <w:tc>
+          <w:tcPr>
+            <w:tcW w:type="dxa" w:w="2664"/>
+            <w:vAlign w:val="center"/>
+            <w:shd w:fill="4472C4"/>
+          </w:tcPr>
+          <w:p>
+            <w:pPr>
+              <w:spacing w:after="0"/>
+            </w:pPr>
+            <w:r/>
+            <w:r>
+              <w:rPr>
+                <w:rFonts w:ascii="Arial" w:hAnsi="Arial"/>
+                <w:b/>
+                <w:color w:val="FFFFFF"/>
+                <w:sz w:val="16"/>
+              </w:rPr>
+              <w:t>Action</w:t>
+            </w:r>
+          </w:p>
+        </w:tc>
+        <w:tc>
+          <w:tcPr>
+            <w:tcW w:type="dxa" w:w="2736"/>
+            <w:vAlign w:val="center"/>
+            <w:shd w:fill="4472C4"/>
+          </w:tcPr>
+          <w:p>
+            <w:pPr>
+              <w:spacing w:after="0"/>
+            </w:pPr>
+            <w:r/>
+            <w:r>
+              <w:rPr>
+                <w:rFonts w:ascii="Arial" w:hAnsi="Arial"/>
+                <w:b/>
+                <w:color w:val="FFFFFF"/>
+                <w:sz w:val="16"/>
+              </w:rPr>
+              <w:t>Expected Result</w:t>
+            </w:r>
+          </w:p>
+        </w:tc>
+        <w:tc>
+          <w:tcPr>
+            <w:tcW w:type="dxa" w:w="1872"/>
+            <w:vAlign w:val="center"/>
+            <w:shd w:fill="4472C4"/>
+          </w:tcPr>
+          <w:p>
+            <w:pPr>
+              <w:spacing w:after="0"/>
+            </w:pPr>
+            <w:r/>
+            <w:r>
+              <w:rPr>
+                <w:rFonts w:ascii="Arial" w:hAnsi="Arial"/>
+                <w:b/>
+                <w:color w:val="FFFFFF"/>
+                <w:sz w:val="16"/>
+              </w:rPr>
+              <w:t>Actual Result</w:t>
+            </w:r>
+          </w:p>
+        </w:tc>
+        <w:tc>
+          <w:tcPr>
+            <w:tcW w:type="dxa" w:w="1008"/>
+            <w:vAlign w:val="center"/>
+            <w:shd w:fill="4472C4"/>
+          </w:tcPr>
+          <w:p>
+            <w:pPr>
+              <w:spacing w:after="0"/>
+            </w:pPr>
+            <w:r/>
+            <w:r>
+              <w:rPr>
+                <w:rFonts w:ascii="Arial" w:hAnsi="Arial"/>
+                <w:b/>
+                <w:color w:val="FFFFFF"/>
+                <w:sz w:val="16"/>
+              </w:rPr>
+              <w:t>Status</w:t>
+            </w:r>
+          </w:p>
+        </w:tc>
+      </w:tr>
+      <w:tr>
+        <w:tc>
+          <w:tcPr>
+            <w:tcW w:type="dxa" w:w="648"/>
+            <w:vAlign w:val="center"/>
+            <w:shd w:fill="FFFFFF"/>
+          </w:tcPr>
+          <w:p>
+            <w:pPr>
+              <w:spacing w:after="0"/>
+            </w:pPr>
+            <w:r/>
+            <w:r>
+              <w:rPr>
+                <w:rFonts w:ascii="Arial" w:hAnsi="Arial"/>
+                <w:b w:val="0"/>
+                <w:sz w:val="16"/>
+              </w:rPr>
+              <w:t>1</w:t>
+            </w:r>
+          </w:p>
+        </w:tc>
+        <w:tc>
+          <w:tcPr>
+            <w:tcW w:type="dxa" w:w="2664"/>
+            <w:vAlign w:val="center"/>
+            <w:shd w:fill="FFFFFF"/>
+          </w:tcPr>
+          <w:p>
+            <w:pPr>
+              <w:spacing w:after="0"/>
+            </w:pPr>
+            <w:r/>
+            <w:r>
+              <w:rPr>
+                <w:rFonts w:ascii="Arial" w:hAnsi="Arial"/>
+                <w:b w:val="0"/>
+                <w:sz w:val="16"/>
+              </w:rPr>
+              <w:t>Open the guest report page</w:t>
+            </w:r>
+          </w:p>
+        </w:tc>
+        <w:tc>
+          <w:tcPr>
+            <w:tcW w:type="dxa" w:w="2736"/>
+            <w:vAlign w:val="center"/>
+            <w:shd w:fill="FFFFFF"/>
+          </w:tcPr>
+          <w:p>
+            <w:pPr>
+              <w:spacing w:after="0"/>
+            </w:pPr>
+            <w:r/>
+            <w:r>
+              <w:rPr>
+                <w:rFonts w:ascii="Arial" w:hAnsi="Arial"/>
+                <w:b w:val="0"/>
+                <w:sz w:val="16"/>
+              </w:rPr>
+              <w:t>Guest form is displayed</w:t>
+            </w:r>
+          </w:p>
+        </w:tc>
+        <w:tc>
+          <w:tcPr>
+            <w:tcW w:type="dxa" w:w="1872"/>
+            <w:vAlign w:val="center"/>
+            <w:shd w:fill="FFFFFF"/>
+          </w:tcPr>
+          <w:p>
+            <w:pPr>
+              <w:spacing w:after="0"/>
+            </w:pPr>
+            <w:r/>
+            <w:r>
+              <w:rPr>
+                <w:rFonts w:ascii="Arial" w:hAnsi="Arial"/>
+                <w:b w:val="0"/>
+                <w:sz w:val="16"/>
+              </w:rPr>
+              <w:t>As expected</w:t>
+            </w:r>
+          </w:p>
+        </w:tc>
+        <w:tc>
+          <w:tcPr>
+            <w:tcW w:type="dxa" w:w="1008"/>
+            <w:vAlign w:val="center"/>
+            <w:shd w:fill="FFFFFF"/>
+          </w:tcPr>
+          <w:p>
+            <w:pPr>
+              <w:spacing w:after="0"/>
+            </w:pPr>
+            <w:r/>
+            <w:r>
+              <w:rPr>
+                <w:rFonts w:ascii="Arial" w:hAnsi="Arial"/>
+                <w:b w:val="0"/>
+                <w:sz w:val="16"/>
+              </w:rPr>
+              <w:t>Pass</w:t>
+            </w:r>
+          </w:p>
+        </w:tc>
+      </w:tr>
+      <w:tr>
+        <w:tc>
+          <w:tcPr>
+            <w:tcW w:type="dxa" w:w="648"/>
+            <w:vAlign w:val="center"/>
+            <w:shd w:fill="F3F6FA"/>
+          </w:tcPr>
+          <w:p>
+            <w:pPr>
+              <w:spacing w:after="0"/>
+            </w:pPr>
+            <w:r/>
+            <w:r>
+              <w:rPr>
+                <w:rFonts w:ascii="Arial" w:hAnsi="Arial"/>
+                <w:b w:val="0"/>
+                <w:sz w:val="16"/>
+              </w:rPr>
+              <w:t>2</w:t>
+            </w:r>
+          </w:p>
+        </w:tc>
+        <w:tc>
+          <w:tcPr>
+            <w:tcW w:type="dxa" w:w="2664"/>
+            <w:vAlign w:val="center"/>
+            <w:shd w:fill="F3F6FA"/>
+          </w:tcPr>
+          <w:p>
+            <w:pPr>
+              <w:spacing w:after="0"/>
+            </w:pPr>
+            <w:r/>
+            <w:r>
+              <w:rPr>
+                <w:rFonts w:ascii="Arial" w:hAnsi="Arial"/>
+                <w:b w:val="0"/>
+                <w:sz w:val="16"/>
+              </w:rPr>
+              <w:t>Enter issue details and attach a valid image</w:t>
+            </w:r>
+          </w:p>
+        </w:tc>
+        <w:tc>
+          <w:tcPr>
+            <w:tcW w:type="dxa" w:w="2736"/>
+            <w:vAlign w:val="center"/>
+            <w:shd w:fill="F3F6FA"/>
+          </w:tcPr>
+          <w:p>
+            <w:pPr>
+              <w:spacing w:after="0"/>
+            </w:pPr>
+            <w:r/>
+            <w:r>
+              <w:rPr>
+                <w:rFonts w:ascii="Arial" w:hAnsi="Arial"/>
+                <w:b w:val="0"/>
+                <w:sz w:val="16"/>
+              </w:rPr>
+              <w:t>Valid guest data and image are accepted</w:t>
+            </w:r>
+          </w:p>
+        </w:tc>
+        <w:tc>
+          <w:tcPr>
+            <w:tcW w:type="dxa" w:w="1872"/>
+            <w:vAlign w:val="center"/>
+            <w:shd w:fill="F3F6FA"/>
+          </w:tcPr>
+          <w:p>
+            <w:pPr>
+              <w:spacing w:after="0"/>
+            </w:pPr>
+            <w:r/>
+            <w:r>
+              <w:rPr>
+                <w:rFonts w:ascii="Arial" w:hAnsi="Arial"/>
+                <w:b w:val="0"/>
+                <w:sz w:val="16"/>
+              </w:rPr>
+              <w:t>As expected</w:t>
+            </w:r>
+          </w:p>
+        </w:tc>
+        <w:tc>
+          <w:tcPr>
+            <w:tcW w:type="dxa" w:w="1008"/>
+            <w:vAlign w:val="center"/>
+            <w:shd w:fill="F3F6FA"/>
+          </w:tcPr>
+          <w:p>
+            <w:pPr>
+              <w:spacing w:after="0"/>
+            </w:pPr>
+            <w:r/>
+            <w:r>
+              <w:rPr>
+                <w:rFonts w:ascii="Arial" w:hAnsi="Arial"/>
+                <w:b w:val="0"/>
+                <w:sz w:val="16"/>
+              </w:rPr>
+              <w:t>Pass</w:t>
+            </w:r>
+          </w:p>
+        </w:tc>
+      </w:tr>
+      <w:tr>
+        <w:tc>
+          <w:tcPr>
+            <w:tcW w:type="dxa" w:w="648"/>
+            <w:vAlign w:val="center"/>
+            <w:shd w:fill="FFFFFF"/>
+          </w:tcPr>
+          <w:p>
+            <w:pPr>
+              <w:spacing w:after="0"/>
+            </w:pPr>
+            <w:r/>
+            <w:r>
+              <w:rPr>
+                <w:rFonts w:ascii="Arial" w:hAnsi="Arial"/>
+                <w:b w:val="0"/>
+                <w:sz w:val="16"/>
+              </w:rPr>
+              <w:t>3</w:t>
+            </w:r>
+          </w:p>
+        </w:tc>
+        <w:tc>
+          <w:tcPr>
+            <w:tcW w:type="dxa" w:w="2664"/>
+            <w:vAlign w:val="center"/>
+            <w:shd w:fill="FFFFFF"/>
+          </w:tcPr>
+          <w:p>
+            <w:pPr>
+              <w:spacing w:after="0"/>
+            </w:pPr>
+            <w:r/>
+            <w:r>
+              <w:rPr>
+                <w:rFonts w:ascii="Arial" w:hAnsi="Arial"/>
+                <w:b w:val="0"/>
+                <w:sz w:val="16"/>
+              </w:rPr>
+              <w:t>Submit the guest report</w:t>
+            </w:r>
+          </w:p>
+        </w:tc>
+        <w:tc>
+          <w:tcPr>
+            <w:tcW w:type="dxa" w:w="2736"/>
+            <w:vAlign w:val="center"/>
+            <w:shd w:fill="FFFFFF"/>
+          </w:tcPr>
+          <w:p>
+            <w:pPr>
+              <w:spacing w:after="0"/>
+            </w:pPr>
+            <w:r/>
+            <w:r>
+              <w:rPr>
+                <w:rFonts w:ascii="Arial" w:hAnsi="Arial"/>
+                <w:b w:val="0"/>
+                <w:sz w:val="16"/>
+              </w:rPr>
+              <w:t>Report is saved as Pending and success feedback appears</w:t>
+            </w:r>
+          </w:p>
+        </w:tc>
+        <w:tc>
+          <w:tcPr>
+            <w:tcW w:type="dxa" w:w="1872"/>
+            <w:vAlign w:val="center"/>
+            <w:shd w:fill="FFFFFF"/>
+          </w:tcPr>
+          <w:p>
+            <w:pPr>
+              <w:spacing w:after="0"/>
+            </w:pPr>
+            <w:r/>
+            <w:r>
+              <w:rPr>
+                <w:rFonts w:ascii="Arial" w:hAnsi="Arial"/>
+                <w:b w:val="0"/>
+                <w:sz w:val="16"/>
+              </w:rPr>
+              <w:t>As expected</w:t>
+            </w:r>
+          </w:p>
+        </w:tc>
+        <w:tc>
+          <w:tcPr>
+            <w:tcW w:type="dxa" w:w="1008"/>
+            <w:vAlign w:val="center"/>
+            <w:shd w:fill="FFFFFF"/>
+          </w:tcPr>
+          <w:p>
+            <w:pPr>
+              <w:spacing w:after="0"/>
+            </w:pPr>
+            <w:r/>
+            <w:r>
+              <w:rPr>
+                <w:rFonts w:ascii="Arial" w:hAnsi="Arial"/>
+                <w:b w:val="0"/>
+                <w:sz w:val="16"/>
+              </w:rPr>
+              <w:t>Pass</w:t>
+            </w:r>
+          </w:p>
+        </w:tc>
+      </w:tr>
+    </w:tbl>
+    <w:p>
+      <w:pPr>
+        <w:spacing w:after="40"/>
+      </w:pPr>
+    </w:p>
+    <w:p>
+      <w:pPr>
+        <w:spacing w:before="60"/>
+      </w:pPr>
+      <w:r>
+        <w:rPr>
+          <w:rFonts w:ascii="Arial" w:hAnsi="Arial"/>
+          <w:b/>
+          <w:color w:val="006100"/>
+          <w:sz w:val="20"/>
+        </w:rPr>
+        <w:t>Result: PASS - All expected outcomes were achieved.</w:t>
+      </w:r>
+    </w:p>
+    <w:p>
+      <w:r>
+        <w:br w:type="page"/>
+      </w:r>
+    </w:p>
+    <w:p>
+      <w:pPr>
+        <w:pStyle w:val="Heading2"/>
+        <w:keepNext/>
+      </w:pPr>
+      <w:r>
+        <w:t>TC-020: Guest cannot view protected maintenance pages</w:t>
+      </w:r>
+    </w:p>
+    <w:tbl>
+      <w:tblPr>
+        <w:tblW w:type="auto" w:w="0"/>
+        <w:jc w:val="center"/>
+        <w:tblLayout w:type="fixed"/>
+        <w:tblLook w:firstColumn="1" w:firstRow="1" w:lastColumn="0" w:lastRow="0" w:noHBand="0" w:noVBand="1" w:val="04A0"/>
+        <w:tblBorders>
+          <w:top w:val="single" w:sz="4" w:color="B4C6E7"/>
+          <w:left w:val="single" w:sz="4" w:color="B4C6E7"/>
+          <w:bottom w:val="single" w:sz="4" w:color="B4C6E7"/>
+          <w:right w:val="single" w:sz="4" w:color="B4C6E7"/>
+          <w:insideH w:val="single" w:sz="4" w:color="B4C6E7"/>
+          <w:insideV w:val="single" w:sz="4" w:color="B4C6E7"/>
+        </w:tblBorders>
+      </w:tblPr>
+      <w:tblGrid>
+        <w:gridCol w:w="4968"/>
+        <w:gridCol w:w="4968"/>
+      </w:tblGrid>
+      <w:tr>
+        <w:tc>
+          <w:tcPr>
+            <w:tcW w:type="dxa" w:w="2232"/>
+            <w:vAlign w:val="center"/>
+            <w:shd w:fill="4472C4"/>
+          </w:tcPr>
+          <w:p>
+            <w:pPr>
+              <w:spacing w:after="0"/>
+            </w:pPr>
+            <w:r/>
+            <w:r>
+              <w:rPr>
+                <w:rFonts w:ascii="Arial" w:hAnsi="Arial"/>
+                <w:b/>
+                <w:color w:val="FFFFFF"/>
+                <w:sz w:val="17"/>
+              </w:rPr>
+              <w:t>Field</w:t>
+            </w:r>
+          </w:p>
+        </w:tc>
+        <w:tc>
+          <w:tcPr>
+            <w:tcW w:type="dxa" w:w="6984"/>
+            <w:vAlign w:val="center"/>
+            <w:shd w:fill="4472C4"/>
+          </w:tcPr>
+          <w:p>
+            <w:pPr>
+              <w:spacing w:after="0"/>
+            </w:pPr>
+            <w:r/>
+            <w:r>
+              <w:rPr>
+                <w:rFonts w:ascii="Arial" w:hAnsi="Arial"/>
+                <w:b/>
+                <w:color w:val="FFFFFF"/>
+                <w:sz w:val="17"/>
+              </w:rPr>
+              <w:t>Details</w:t>
+            </w:r>
+          </w:p>
+        </w:tc>
+      </w:tr>
+      <w:tr>
+        <w:tc>
+          <w:tcPr>
+            <w:tcW w:type="dxa" w:w="2232"/>
+            <w:vAlign w:val="center"/>
+            <w:shd w:fill="FFFFFF"/>
+          </w:tcPr>
+          <w:p>
+            <w:pPr>
+              <w:spacing w:after="0"/>
+            </w:pPr>
+            <w:r/>
+            <w:r>
+              <w:rPr>
+                <w:rFonts w:ascii="Arial" w:hAnsi="Arial"/>
+                <w:b w:val="0"/>
+                <w:sz w:val="17"/>
+              </w:rPr>
+              <w:t>Test Case ID</w:t>
+            </w:r>
+          </w:p>
+        </w:tc>
+        <w:tc>
+          <w:tcPr>
+            <w:tcW w:type="dxa" w:w="6984"/>
+            <w:vAlign w:val="center"/>
+            <w:shd w:fill="FFFFFF"/>
+          </w:tcPr>
+          <w:p>
+            <w:pPr>
+              <w:spacing w:after="0"/>
+            </w:pPr>
+            <w:r/>
+            <w:r>
+              <w:rPr>
+                <w:rFonts w:ascii="Arial" w:hAnsi="Arial"/>
+                <w:b w:val="0"/>
+                <w:sz w:val="17"/>
+              </w:rPr>
+              <w:t>TC-020</w:t>
+            </w:r>
+          </w:p>
+        </w:tc>
+      </w:tr>
+      <w:tr>
+        <w:tc>
+          <w:tcPr>
+            <w:tcW w:type="dxa" w:w="2232"/>
+            <w:vAlign w:val="center"/>
+            <w:shd w:fill="F3F6FA"/>
+          </w:tcPr>
+          <w:p>
+            <w:pPr>
+              <w:spacing w:after="0"/>
+            </w:pPr>
+            <w:r/>
+            <w:r>
+              <w:rPr>
+                <w:rFonts w:ascii="Arial" w:hAnsi="Arial"/>
+                <w:b w:val="0"/>
+                <w:sz w:val="17"/>
+              </w:rPr>
+              <w:t>Version</w:t>
+            </w:r>
+          </w:p>
+        </w:tc>
+        <w:tc>
+          <w:tcPr>
+            <w:tcW w:type="dxa" w:w="6984"/>
+            <w:vAlign w:val="center"/>
+            <w:shd w:fill="F3F6FA"/>
+          </w:tcPr>
+          <w:p>
+            <w:pPr>
+              <w:spacing w:after="0"/>
+            </w:pPr>
+            <w:r/>
+            <w:r>
+              <w:rPr>
+                <w:rFonts w:ascii="Arial" w:hAnsi="Arial"/>
+                <w:b w:val="0"/>
+                <w:sz w:val="17"/>
+              </w:rPr>
+              <w:t>1.0</w:t>
+            </w:r>
+          </w:p>
+        </w:tc>
+      </w:tr>
+      <w:tr>
+        <w:tc>
+          <w:tcPr>
+            <w:tcW w:type="dxa" w:w="2232"/>
+            <w:vAlign w:val="center"/>
+            <w:shd w:fill="FFFFFF"/>
+          </w:tcPr>
+          <w:p>
+            <w:pPr>
+              <w:spacing w:after="0"/>
+            </w:pPr>
+            <w:r/>
+            <w:r>
+              <w:rPr>
+                <w:rFonts w:ascii="Arial" w:hAnsi="Arial"/>
+                <w:b w:val="0"/>
+                <w:sz w:val="17"/>
+              </w:rPr>
+              <w:t>Date Tested</w:t>
+            </w:r>
+          </w:p>
+        </w:tc>
+        <w:tc>
+          <w:tcPr>
+            <w:tcW w:type="dxa" w:w="6984"/>
+            <w:vAlign w:val="center"/>
+            <w:shd w:fill="FFFFFF"/>
+          </w:tcPr>
+          <w:p>
+            <w:pPr>
+              <w:spacing w:after="0"/>
+            </w:pPr>
+            <w:r/>
+            <w:r>
+              <w:rPr>
+                <w:rFonts w:ascii="Arial" w:hAnsi="Arial"/>
+                <w:b w:val="0"/>
+                <w:sz w:val="17"/>
+              </w:rPr>
+              <w:t>01 July 2026</w:t>
+            </w:r>
+          </w:p>
+        </w:tc>
+      </w:tr>
+      <w:tr>
+        <w:tc>
+          <w:tcPr>
+            <w:tcW w:type="dxa" w:w="2232"/>
+            <w:vAlign w:val="center"/>
+            <w:shd w:fill="F3F6FA"/>
+          </w:tcPr>
+          <w:p>
+            <w:pPr>
+              <w:spacing w:after="0"/>
+            </w:pPr>
+            <w:r/>
+            <w:r>
+              <w:rPr>
+                <w:rFonts w:ascii="Arial" w:hAnsi="Arial"/>
+                <w:b w:val="0"/>
+                <w:sz w:val="17"/>
+              </w:rPr>
+              <w:t>Final Status</w:t>
+            </w:r>
+          </w:p>
+        </w:tc>
+        <w:tc>
+          <w:tcPr>
+            <w:tcW w:type="dxa" w:w="6984"/>
+            <w:vAlign w:val="center"/>
+            <w:shd w:fill="F3F6FA"/>
+          </w:tcPr>
+          <w:p>
+            <w:pPr>
+              <w:spacing w:after="0"/>
+            </w:pPr>
+            <w:r/>
+            <w:r>
+              <w:rPr>
+                <w:rFonts w:ascii="Arial" w:hAnsi="Arial"/>
+                <w:b w:val="0"/>
+                <w:sz w:val="17"/>
+              </w:rPr>
+              <w:t>Pass</w:t>
+            </w:r>
+          </w:p>
+        </w:tc>
+      </w:tr>
+      <w:tr>
+        <w:tc>
+          <w:tcPr>
+            <w:tcW w:type="dxa" w:w="2232"/>
+            <w:vAlign w:val="center"/>
+            <w:shd w:fill="FFFFFF"/>
+          </w:tcPr>
+          <w:p>
+            <w:pPr>
+              <w:spacing w:after="0"/>
+            </w:pPr>
+            <w:r/>
+            <w:r>
+              <w:rPr>
+                <w:rFonts w:ascii="Arial" w:hAnsi="Arial"/>
+                <w:b w:val="0"/>
+                <w:sz w:val="17"/>
+              </w:rPr>
+              <w:t>Test Scenario</w:t>
+            </w:r>
+          </w:p>
+        </w:tc>
+        <w:tc>
+          <w:tcPr>
+            <w:tcW w:type="dxa" w:w="6984"/>
+            <w:vAlign w:val="center"/>
+            <w:shd w:fill="FFFFFF"/>
+          </w:tcPr>
+          <w:p>
+            <w:pPr>
+              <w:spacing w:after="0"/>
+            </w:pPr>
+            <w:r/>
+            <w:r>
+              <w:rPr>
+                <w:rFonts w:ascii="Arial" w:hAnsi="Arial"/>
+                <w:b w:val="0"/>
+                <w:sz w:val="17"/>
+              </w:rPr>
+              <w:t>Guest cannot view protected maintenance pages</w:t>
+            </w:r>
+          </w:p>
+        </w:tc>
+      </w:tr>
+      <w:tr>
+        <w:tc>
+          <w:tcPr>
+            <w:tcW w:type="dxa" w:w="2232"/>
+            <w:vAlign w:val="center"/>
+            <w:shd w:fill="F3F6FA"/>
+          </w:tcPr>
+          <w:p>
+            <w:pPr>
+              <w:spacing w:after="0"/>
+            </w:pPr>
+            <w:r/>
+            <w:r>
+              <w:rPr>
+                <w:rFonts w:ascii="Arial" w:hAnsi="Arial"/>
+                <w:b w:val="0"/>
+                <w:sz w:val="17"/>
+              </w:rPr>
+              <w:t>Prerequisite 1</w:t>
+            </w:r>
+          </w:p>
+        </w:tc>
+        <w:tc>
+          <w:tcPr>
+            <w:tcW w:type="dxa" w:w="6984"/>
+            <w:vAlign w:val="center"/>
+            <w:shd w:fill="F3F6FA"/>
+          </w:tcPr>
+          <w:p>
+            <w:pPr>
+              <w:spacing w:after="0"/>
+            </w:pPr>
+            <w:r/>
+            <w:r>
+              <w:rPr>
+                <w:rFonts w:ascii="Arial" w:hAnsi="Arial"/>
+                <w:b w:val="0"/>
+                <w:sz w:val="17"/>
+              </w:rPr>
+              <w:t>Application running at http://127.0.0.1:8000</w:t>
+            </w:r>
+          </w:p>
+        </w:tc>
+      </w:tr>
+      <w:tr>
+        <w:tc>
+          <w:tcPr>
+            <w:tcW w:type="dxa" w:w="2232"/>
+            <w:vAlign w:val="center"/>
+            <w:shd w:fill="FFFFFF"/>
+          </w:tcPr>
+          <w:p>
+            <w:pPr>
+              <w:spacing w:after="0"/>
+            </w:pPr>
+            <w:r/>
+            <w:r>
+              <w:rPr>
+                <w:rFonts w:ascii="Arial" w:hAnsi="Arial"/>
+                <w:b w:val="0"/>
+                <w:sz w:val="17"/>
+              </w:rPr>
+              <w:t>Prerequisite 2</w:t>
+            </w:r>
+          </w:p>
+        </w:tc>
+        <w:tc>
+          <w:tcPr>
+            <w:tcW w:type="dxa" w:w="6984"/>
+            <w:vAlign w:val="center"/>
+            <w:shd w:fill="FFFFFF"/>
+          </w:tcPr>
+          <w:p>
+            <w:pPr>
+              <w:spacing w:after="0"/>
+            </w:pPr>
+            <w:r/>
+            <w:r>
+              <w:rPr>
+                <w:rFonts w:ascii="Arial" w:hAnsi="Arial"/>
+                <w:b w:val="0"/>
+                <w:sz w:val="17"/>
+              </w:rPr>
+              <w:t>Supported browser and appropriate test account</w:t>
+            </w:r>
+          </w:p>
+        </w:tc>
+      </w:tr>
+      <w:tr>
+        <w:tc>
+          <w:tcPr>
+            <w:tcW w:type="dxa" w:w="2232"/>
+            <w:vAlign w:val="center"/>
+            <w:shd w:fill="F3F6FA"/>
+          </w:tcPr>
+          <w:p>
+            <w:pPr>
+              <w:spacing w:after="0"/>
+            </w:pPr>
+            <w:r/>
+            <w:r>
+              <w:rPr>
+                <w:rFonts w:ascii="Arial" w:hAnsi="Arial"/>
+                <w:b w:val="0"/>
+                <w:sz w:val="17"/>
+              </w:rPr>
+              <w:t>Test Data</w:t>
+            </w:r>
+          </w:p>
+        </w:tc>
+        <w:tc>
+          <w:tcPr>
+            <w:tcW w:type="dxa" w:w="6984"/>
+            <w:vAlign w:val="center"/>
+            <w:shd w:fill="F3F6FA"/>
+          </w:tcPr>
+          <w:p>
+            <w:pPr>
+              <w:spacing w:after="0"/>
+            </w:pPr>
+            <w:r/>
+            <w:r>
+              <w:rPr>
+                <w:rFonts w:ascii="Arial" w:hAnsi="Arial"/>
+                <w:b w:val="0"/>
+                <w:sz w:val="17"/>
+              </w:rPr>
+              <w:t>Unauthenticated guest session</w:t>
+            </w:r>
+          </w:p>
+        </w:tc>
+      </w:tr>
+    </w:tbl>
+    <w:p>
+      <w:pPr>
+        <w:spacing w:after="40"/>
+      </w:pPr>
+    </w:p>
+    <w:tbl>
+      <w:tblPr>
+        <w:tblW w:type="auto" w:w="0"/>
+        <w:jc w:val="center"/>
+        <w:tblLayout w:type="fixed"/>
+        <w:tblLook w:firstColumn="1" w:firstRow="1" w:lastColumn="0" w:lastRow="0" w:noHBand="0" w:noVBand="1" w:val="04A0"/>
+        <w:tblBorders>
+          <w:top w:val="single" w:sz="4" w:color="B4C6E7"/>
+          <w:left w:val="single" w:sz="4" w:color="B4C6E7"/>
+          <w:bottom w:val="single" w:sz="4" w:color="B4C6E7"/>
+          <w:right w:val="single" w:sz="4" w:color="B4C6E7"/>
+          <w:insideH w:val="single" w:sz="4" w:color="B4C6E7"/>
+          <w:insideV w:val="single" w:sz="4" w:color="B4C6E7"/>
+        </w:tblBorders>
+      </w:tblPr>
+      <w:tblGrid>
+        <w:gridCol w:w="1987"/>
+        <w:gridCol w:w="1987"/>
+        <w:gridCol w:w="1987"/>
+        <w:gridCol w:w="1987"/>
+        <w:gridCol w:w="1987"/>
+      </w:tblGrid>
+      <w:tr>
+        <w:tc>
+          <w:tcPr>
+            <w:tcW w:type="dxa" w:w="648"/>
+            <w:vAlign w:val="center"/>
+            <w:shd w:fill="4472C4"/>
+          </w:tcPr>
+          <w:p>
+            <w:pPr>
+              <w:spacing w:after="0"/>
+            </w:pPr>
+            <w:r/>
+            <w:r>
+              <w:rPr>
+                <w:rFonts w:ascii="Arial" w:hAnsi="Arial"/>
+                <w:b/>
+                <w:color w:val="FFFFFF"/>
+                <w:sz w:val="16"/>
+              </w:rPr>
+              <w:t>Step</w:t>
+            </w:r>
+          </w:p>
+        </w:tc>
+        <w:tc>
+          <w:tcPr>
+            <w:tcW w:type="dxa" w:w="2664"/>
+            <w:vAlign w:val="center"/>
+            <w:shd w:fill="4472C4"/>
+          </w:tcPr>
+          <w:p>
+            <w:pPr>
+              <w:spacing w:after="0"/>
+            </w:pPr>
+            <w:r/>
+            <w:r>
+              <w:rPr>
+                <w:rFonts w:ascii="Arial" w:hAnsi="Arial"/>
+                <w:b/>
+                <w:color w:val="FFFFFF"/>
+                <w:sz w:val="16"/>
+              </w:rPr>
+              <w:t>Action</w:t>
+            </w:r>
+          </w:p>
+        </w:tc>
+        <w:tc>
+          <w:tcPr>
+            <w:tcW w:type="dxa" w:w="2736"/>
+            <w:vAlign w:val="center"/>
+            <w:shd w:fill="4472C4"/>
+          </w:tcPr>
+          <w:p>
+            <w:pPr>
+              <w:spacing w:after="0"/>
+            </w:pPr>
+            <w:r/>
+            <w:r>
+              <w:rPr>
+                <w:rFonts w:ascii="Arial" w:hAnsi="Arial"/>
+                <w:b/>
+                <w:color w:val="FFFFFF"/>
+                <w:sz w:val="16"/>
+              </w:rPr>
+              <w:t>Expected Result</w:t>
+            </w:r>
+          </w:p>
+        </w:tc>
+        <w:tc>
+          <w:tcPr>
+            <w:tcW w:type="dxa" w:w="1872"/>
+            <w:vAlign w:val="center"/>
+            <w:shd w:fill="4472C4"/>
+          </w:tcPr>
+          <w:p>
+            <w:pPr>
+              <w:spacing w:after="0"/>
+            </w:pPr>
+            <w:r/>
+            <w:r>
+              <w:rPr>
+                <w:rFonts w:ascii="Arial" w:hAnsi="Arial"/>
+                <w:b/>
+                <w:color w:val="FFFFFF"/>
+                <w:sz w:val="16"/>
+              </w:rPr>
+              <w:t>Actual Result</w:t>
+            </w:r>
+          </w:p>
+        </w:tc>
+        <w:tc>
+          <w:tcPr>
+            <w:tcW w:type="dxa" w:w="1008"/>
+            <w:vAlign w:val="center"/>
+            <w:shd w:fill="4472C4"/>
+          </w:tcPr>
+          <w:p>
+            <w:pPr>
+              <w:spacing w:after="0"/>
+            </w:pPr>
+            <w:r/>
+            <w:r>
+              <w:rPr>
+                <w:rFonts w:ascii="Arial" w:hAnsi="Arial"/>
+                <w:b/>
+                <w:color w:val="FFFFFF"/>
+                <w:sz w:val="16"/>
+              </w:rPr>
+              <w:t>Status</w:t>
+            </w:r>
+          </w:p>
+        </w:tc>
+      </w:tr>
+      <w:tr>
+        <w:tc>
+          <w:tcPr>
+            <w:tcW w:type="dxa" w:w="648"/>
+            <w:vAlign w:val="center"/>
+            <w:shd w:fill="FFFFFF"/>
+          </w:tcPr>
+          <w:p>
+            <w:pPr>
+              <w:spacing w:after="0"/>
+            </w:pPr>
+            <w:r/>
+            <w:r>
+              <w:rPr>
+                <w:rFonts w:ascii="Arial" w:hAnsi="Arial"/>
+                <w:b w:val="0"/>
+                <w:sz w:val="16"/>
+              </w:rPr>
+              <w:t>1</w:t>
+            </w:r>
+          </w:p>
+        </w:tc>
+        <w:tc>
+          <w:tcPr>
+            <w:tcW w:type="dxa" w:w="2664"/>
+            <w:vAlign w:val="center"/>
+            <w:shd w:fill="FFFFFF"/>
+          </w:tcPr>
+          <w:p>
+            <w:pPr>
+              <w:spacing w:after="0"/>
+            </w:pPr>
+            <w:r/>
+            <w:r>
+              <w:rPr>
+                <w:rFonts w:ascii="Arial" w:hAnsi="Arial"/>
+                <w:b w:val="0"/>
+                <w:sz w:val="16"/>
+              </w:rPr>
+              <w:t>Submit or open guest report page</w:t>
+            </w:r>
+          </w:p>
+        </w:tc>
+        <w:tc>
+          <w:tcPr>
+            <w:tcW w:type="dxa" w:w="2736"/>
+            <w:vAlign w:val="center"/>
+            <w:shd w:fill="FFFFFF"/>
+          </w:tcPr>
+          <w:p>
+            <w:pPr>
+              <w:spacing w:after="0"/>
+            </w:pPr>
+            <w:r/>
+            <w:r>
+              <w:rPr>
+                <w:rFonts w:ascii="Arial" w:hAnsi="Arial"/>
+                <w:b w:val="0"/>
+                <w:sz w:val="16"/>
+              </w:rPr>
+              <w:t>Guest report page remains public</w:t>
+            </w:r>
+          </w:p>
+        </w:tc>
+        <w:tc>
+          <w:tcPr>
+            <w:tcW w:type="dxa" w:w="1872"/>
+            <w:vAlign w:val="center"/>
+            <w:shd w:fill="FFFFFF"/>
+          </w:tcPr>
+          <w:p>
+            <w:pPr>
+              <w:spacing w:after="0"/>
+            </w:pPr>
+            <w:r/>
+            <w:r>
+              <w:rPr>
+                <w:rFonts w:ascii="Arial" w:hAnsi="Arial"/>
+                <w:b w:val="0"/>
+                <w:sz w:val="16"/>
+              </w:rPr>
+              <w:t>As expected</w:t>
+            </w:r>
+          </w:p>
+        </w:tc>
+        <w:tc>
+          <w:tcPr>
+            <w:tcW w:type="dxa" w:w="1008"/>
+            <w:vAlign w:val="center"/>
+            <w:shd w:fill="FFFFFF"/>
+          </w:tcPr>
+          <w:p>
+            <w:pPr>
+              <w:spacing w:after="0"/>
+            </w:pPr>
+            <w:r/>
+            <w:r>
+              <w:rPr>
+                <w:rFonts w:ascii="Arial" w:hAnsi="Arial"/>
+                <w:b w:val="0"/>
+                <w:sz w:val="16"/>
+              </w:rPr>
+              <w:t>Pass</w:t>
+            </w:r>
+          </w:p>
+        </w:tc>
+      </w:tr>
+      <w:tr>
+        <w:tc>
+          <w:tcPr>
+            <w:tcW w:type="dxa" w:w="648"/>
+            <w:vAlign w:val="center"/>
+            <w:shd w:fill="F3F6FA"/>
+          </w:tcPr>
+          <w:p>
+            <w:pPr>
+              <w:spacing w:after="0"/>
+            </w:pPr>
+            <w:r/>
+            <w:r>
+              <w:rPr>
+                <w:rFonts w:ascii="Arial" w:hAnsi="Arial"/>
+                <w:b w:val="0"/>
+                <w:sz w:val="16"/>
+              </w:rPr>
+              <w:t>2</w:t>
+            </w:r>
+          </w:p>
+        </w:tc>
+        <w:tc>
+          <w:tcPr>
+            <w:tcW w:type="dxa" w:w="2664"/>
+            <w:vAlign w:val="center"/>
+            <w:shd w:fill="F3F6FA"/>
+          </w:tcPr>
+          <w:p>
+            <w:pPr>
+              <w:spacing w:after="0"/>
+            </w:pPr>
+            <w:r/>
+            <w:r>
+              <w:rPr>
+                <w:rFonts w:ascii="Arial" w:hAnsi="Arial"/>
+                <w:b w:val="0"/>
+                <w:sz w:val="16"/>
+              </w:rPr>
+              <w:t>Navigate directly to /dashboard</w:t>
+            </w:r>
+          </w:p>
+        </w:tc>
+        <w:tc>
+          <w:tcPr>
+            <w:tcW w:type="dxa" w:w="2736"/>
+            <w:vAlign w:val="center"/>
+            <w:shd w:fill="F3F6FA"/>
+          </w:tcPr>
+          <w:p>
+            <w:pPr>
+              <w:spacing w:after="0"/>
+            </w:pPr>
+            <w:r/>
+            <w:r>
+              <w:rPr>
+                <w:rFonts w:ascii="Arial" w:hAnsi="Arial"/>
+                <w:b w:val="0"/>
+                <w:sz w:val="16"/>
+              </w:rPr>
+              <w:t>Dashboard redirects to Login</w:t>
+            </w:r>
+          </w:p>
+        </w:tc>
+        <w:tc>
+          <w:tcPr>
+            <w:tcW w:type="dxa" w:w="1872"/>
+            <w:vAlign w:val="center"/>
+            <w:shd w:fill="F3F6FA"/>
+          </w:tcPr>
+          <w:p>
+            <w:pPr>
+              <w:spacing w:after="0"/>
+            </w:pPr>
+            <w:r/>
+            <w:r>
+              <w:rPr>
+                <w:rFonts w:ascii="Arial" w:hAnsi="Arial"/>
+                <w:b w:val="0"/>
+                <w:sz w:val="16"/>
+              </w:rPr>
+              <w:t>As expected</w:t>
+            </w:r>
+          </w:p>
+        </w:tc>
+        <w:tc>
+          <w:tcPr>
+            <w:tcW w:type="dxa" w:w="1008"/>
+            <w:vAlign w:val="center"/>
+            <w:shd w:fill="F3F6FA"/>
+          </w:tcPr>
+          <w:p>
+            <w:pPr>
+              <w:spacing w:after="0"/>
+            </w:pPr>
+            <w:r/>
+            <w:r>
+              <w:rPr>
+                <w:rFonts w:ascii="Arial" w:hAnsi="Arial"/>
+                <w:b w:val="0"/>
+                <w:sz w:val="16"/>
+              </w:rPr>
+              <w:t>Pass</w:t>
+            </w:r>
+          </w:p>
+        </w:tc>
+      </w:tr>
+      <w:tr>
+        <w:tc>
+          <w:tcPr>
+            <w:tcW w:type="dxa" w:w="648"/>
+            <w:vAlign w:val="center"/>
+            <w:shd w:fill="FFFFFF"/>
+          </w:tcPr>
+          <w:p>
+            <w:pPr>
+              <w:spacing w:after="0"/>
+            </w:pPr>
+            <w:r/>
+            <w:r>
+              <w:rPr>
+                <w:rFonts w:ascii="Arial" w:hAnsi="Arial"/>
+                <w:b w:val="0"/>
+                <w:sz w:val="16"/>
+              </w:rPr>
+              <w:t>3</w:t>
+            </w:r>
+          </w:p>
+        </w:tc>
+        <w:tc>
+          <w:tcPr>
+            <w:tcW w:type="dxa" w:w="2664"/>
+            <w:vAlign w:val="center"/>
+            <w:shd w:fill="FFFFFF"/>
+          </w:tcPr>
+          <w:p>
+            <w:pPr>
+              <w:spacing w:after="0"/>
+            </w:pPr>
+            <w:r/>
+            <w:r>
+              <w:rPr>
+                <w:rFonts w:ascii="Arial" w:hAnsi="Arial"/>
+                <w:b w:val="0"/>
+                <w:sz w:val="16"/>
+              </w:rPr>
+              <w:t>Navigate directly to /maintenance</w:t>
+            </w:r>
+          </w:p>
+        </w:tc>
+        <w:tc>
+          <w:tcPr>
+            <w:tcW w:type="dxa" w:w="2736"/>
+            <w:vAlign w:val="center"/>
+            <w:shd w:fill="FFFFFF"/>
+          </w:tcPr>
+          <w:p>
+            <w:pPr>
+              <w:spacing w:after="0"/>
+            </w:pPr>
+            <w:r/>
+            <w:r>
+              <w:rPr>
+                <w:rFonts w:ascii="Arial" w:hAnsi="Arial"/>
+                <w:b w:val="0"/>
+                <w:sz w:val="16"/>
+              </w:rPr>
+              <w:t>Maintenance list redirects to Login</w:t>
+            </w:r>
+          </w:p>
+        </w:tc>
+        <w:tc>
+          <w:tcPr>
+            <w:tcW w:type="dxa" w:w="1872"/>
+            <w:vAlign w:val="center"/>
+            <w:shd w:fill="FFFFFF"/>
+          </w:tcPr>
+          <w:p>
+            <w:pPr>
+              <w:spacing w:after="0"/>
+            </w:pPr>
+            <w:r/>
+            <w:r>
+              <w:rPr>
+                <w:rFonts w:ascii="Arial" w:hAnsi="Arial"/>
+                <w:b w:val="0"/>
+                <w:sz w:val="16"/>
+              </w:rPr>
+              <w:t>As expected</w:t>
+            </w:r>
+          </w:p>
+        </w:tc>
+        <w:tc>
+          <w:tcPr>
+            <w:tcW w:type="dxa" w:w="1008"/>
+            <w:vAlign w:val="center"/>
+            <w:shd w:fill="FFFFFF"/>
+          </w:tcPr>
+          <w:p>
+            <w:pPr>
+              <w:spacing w:after="0"/>
+            </w:pPr>
+            <w:r/>
+            <w:r>
+              <w:rPr>
+                <w:rFonts w:ascii="Arial" w:hAnsi="Arial"/>
+                <w:b w:val="0"/>
+                <w:sz w:val="16"/>
+              </w:rPr>
+              <w:t>Pass</w:t>
+            </w:r>
+          </w:p>
+        </w:tc>
+      </w:tr>
+    </w:tbl>
+    <w:p>
+      <w:pPr>
+        <w:spacing w:after="40"/>
+      </w:pPr>
+    </w:p>
+    <w:p>
+      <w:pPr>
+        <w:spacing w:before="60"/>
+      </w:pPr>
+      <w:r>
+        <w:rPr>
+          <w:rFonts w:ascii="Arial" w:hAnsi="Arial"/>
+          <w:b/>
+          <w:color w:val="006100"/>
+          <w:sz w:val="20"/>
+        </w:rPr>
+        <w:t>Result: PASS - All expected outcomes were achieved.</w:t>
+      </w:r>
+    </w:p>
+    <w:p>
+      <w:r>
+        <w:br w:type="page"/>
+      </w:r>
+    </w:p>
+    <w:p>
+      <w:pPr>
+        <w:pStyle w:val="Heading2"/>
+        <w:keepNext/>
+      </w:pPr>
+      <w:r>
+        <w:t>TC-021: Automated regression suite</w:t>
+      </w:r>
+    </w:p>
+    <w:tbl>
+      <w:tblPr>
+        <w:tblW w:type="auto" w:w="0"/>
+        <w:jc w:val="center"/>
+        <w:tblLayout w:type="fixed"/>
+        <w:tblLook w:firstColumn="1" w:firstRow="1" w:lastColumn="0" w:lastRow="0" w:noHBand="0" w:noVBand="1" w:val="04A0"/>
+        <w:tblBorders>
+          <w:top w:val="single" w:sz="4" w:color="B4C6E7"/>
+          <w:left w:val="single" w:sz="4" w:color="B4C6E7"/>
+          <w:bottom w:val="single" w:sz="4" w:color="B4C6E7"/>
+          <w:right w:val="single" w:sz="4" w:color="B4C6E7"/>
+          <w:insideH w:val="single" w:sz="4" w:color="B4C6E7"/>
+          <w:insideV w:val="single" w:sz="4" w:color="B4C6E7"/>
+        </w:tblBorders>
+      </w:tblPr>
+      <w:tblGrid>
+        <w:gridCol w:w="4968"/>
+        <w:gridCol w:w="4968"/>
+      </w:tblGrid>
+      <w:tr>
+        <w:tc>
+          <w:tcPr>
+            <w:tcW w:type="dxa" w:w="2232"/>
+            <w:vAlign w:val="center"/>
+            <w:shd w:fill="4472C4"/>
+          </w:tcPr>
+          <w:p>
+            <w:pPr>
+              <w:spacing w:after="0"/>
+            </w:pPr>
+            <w:r/>
+            <w:r>
+              <w:rPr>
+                <w:rFonts w:ascii="Arial" w:hAnsi="Arial"/>
+                <w:b/>
+                <w:color w:val="FFFFFF"/>
+                <w:sz w:val="17"/>
+              </w:rPr>
+              <w:t>Field</w:t>
+            </w:r>
+          </w:p>
+        </w:tc>
+        <w:tc>
+          <w:tcPr>
+            <w:tcW w:type="dxa" w:w="6984"/>
+            <w:vAlign w:val="center"/>
+            <w:shd w:fill="4472C4"/>
+          </w:tcPr>
+          <w:p>
+            <w:pPr>
+              <w:spacing w:after="0"/>
+            </w:pPr>
+            <w:r/>
+            <w:r>
+              <w:rPr>
+                <w:rFonts w:ascii="Arial" w:hAnsi="Arial"/>
+                <w:b/>
+                <w:color w:val="FFFFFF"/>
+                <w:sz w:val="17"/>
+              </w:rPr>
+              <w:t>Details</w:t>
+            </w:r>
+          </w:p>
+        </w:tc>
+      </w:tr>
+      <w:tr>
+        <w:tc>
+          <w:tcPr>
+            <w:tcW w:type="dxa" w:w="2232"/>
+            <w:vAlign w:val="center"/>
+            <w:shd w:fill="FFFFFF"/>
+          </w:tcPr>
+          <w:p>
+            <w:pPr>
+              <w:spacing w:after="0"/>
+            </w:pPr>
+            <w:r/>
+            <w:r>
+              <w:rPr>
+                <w:rFonts w:ascii="Arial" w:hAnsi="Arial"/>
+                <w:b w:val="0"/>
+                <w:sz w:val="17"/>
+              </w:rPr>
+              <w:t>Test Case ID</w:t>
+            </w:r>
+          </w:p>
+        </w:tc>
+        <w:tc>
+          <w:tcPr>
+            <w:tcW w:type="dxa" w:w="6984"/>
+            <w:vAlign w:val="center"/>
+            <w:shd w:fill="FFFFFF"/>
+          </w:tcPr>
+          <w:p>
+            <w:pPr>
+              <w:spacing w:after="0"/>
+            </w:pPr>
+            <w:r/>
+            <w:r>
+              <w:rPr>
+                <w:rFonts w:ascii="Arial" w:hAnsi="Arial"/>
+                <w:b w:val="0"/>
+                <w:sz w:val="17"/>
+              </w:rPr>
+              <w:t>TC-021</w:t>
+            </w:r>
+          </w:p>
+        </w:tc>
+      </w:tr>
+      <w:tr>
+        <w:tc>
+          <w:tcPr>
+            <w:tcW w:type="dxa" w:w="2232"/>
+            <w:vAlign w:val="center"/>
+            <w:shd w:fill="F3F6FA"/>
+          </w:tcPr>
+          <w:p>
+            <w:pPr>
+              <w:spacing w:after="0"/>
+            </w:pPr>
+            <w:r/>
+            <w:r>
+              <w:rPr>
+                <w:rFonts w:ascii="Arial" w:hAnsi="Arial"/>
+                <w:b w:val="0"/>
+                <w:sz w:val="17"/>
+              </w:rPr>
+              <w:t>Version</w:t>
+            </w:r>
+          </w:p>
+        </w:tc>
+        <w:tc>
+          <w:tcPr>
+            <w:tcW w:type="dxa" w:w="6984"/>
+            <w:vAlign w:val="center"/>
+            <w:shd w:fill="F3F6FA"/>
+          </w:tcPr>
+          <w:p>
+            <w:pPr>
+              <w:spacing w:after="0"/>
+            </w:pPr>
+            <w:r/>
+            <w:r>
+              <w:rPr>
+                <w:rFonts w:ascii="Arial" w:hAnsi="Arial"/>
+                <w:b w:val="0"/>
+                <w:sz w:val="17"/>
+              </w:rPr>
+              <w:t>1.0</w:t>
+            </w:r>
+          </w:p>
+        </w:tc>
+      </w:tr>
+      <w:tr>
+        <w:tc>
+          <w:tcPr>
+            <w:tcW w:type="dxa" w:w="2232"/>
+            <w:vAlign w:val="center"/>
+            <w:shd w:fill="FFFFFF"/>
+          </w:tcPr>
+          <w:p>
+            <w:pPr>
+              <w:spacing w:after="0"/>
+            </w:pPr>
+            <w:r/>
+            <w:r>
+              <w:rPr>
+                <w:rFonts w:ascii="Arial" w:hAnsi="Arial"/>
+                <w:b w:val="0"/>
+                <w:sz w:val="17"/>
+              </w:rPr>
+              <w:t>Date Tested</w:t>
+            </w:r>
+          </w:p>
+        </w:tc>
+        <w:tc>
+          <w:tcPr>
+            <w:tcW w:type="dxa" w:w="6984"/>
+            <w:vAlign w:val="center"/>
+            <w:shd w:fill="FFFFFF"/>
+          </w:tcPr>
+          <w:p>
+            <w:pPr>
+              <w:spacing w:after="0"/>
+            </w:pPr>
+            <w:r/>
+            <w:r>
+              <w:rPr>
+                <w:rFonts w:ascii="Arial" w:hAnsi="Arial"/>
+                <w:b w:val="0"/>
+                <w:sz w:val="17"/>
+              </w:rPr>
+              <w:t>01 July 2026</w:t>
+            </w:r>
+          </w:p>
+        </w:tc>
+      </w:tr>
+      <w:tr>
+        <w:tc>
+          <w:tcPr>
+            <w:tcW w:type="dxa" w:w="2232"/>
+            <w:vAlign w:val="center"/>
+            <w:shd w:fill="F3F6FA"/>
+          </w:tcPr>
+          <w:p>
+            <w:pPr>
+              <w:spacing w:after="0"/>
+            </w:pPr>
+            <w:r/>
+            <w:r>
+              <w:rPr>
+                <w:rFonts w:ascii="Arial" w:hAnsi="Arial"/>
+                <w:b w:val="0"/>
+                <w:sz w:val="17"/>
+              </w:rPr>
+              <w:t>Final Status</w:t>
+            </w:r>
+          </w:p>
+        </w:tc>
+        <w:tc>
+          <w:tcPr>
+            <w:tcW w:type="dxa" w:w="6984"/>
+            <w:vAlign w:val="center"/>
+            <w:shd w:fill="F3F6FA"/>
+          </w:tcPr>
+          <w:p>
+            <w:pPr>
+              <w:spacing w:after="0"/>
+            </w:pPr>
+            <w:r/>
+            <w:r>
+              <w:rPr>
+                <w:rFonts w:ascii="Arial" w:hAnsi="Arial"/>
+                <w:b w:val="0"/>
+                <w:sz w:val="17"/>
+              </w:rPr>
+              <w:t>Pass</w:t>
+            </w:r>
+          </w:p>
+        </w:tc>
+      </w:tr>
+      <w:tr>
+        <w:tc>
+          <w:tcPr>
+            <w:tcW w:type="dxa" w:w="2232"/>
+            <w:vAlign w:val="center"/>
+            <w:shd w:fill="FFFFFF"/>
+          </w:tcPr>
+          <w:p>
+            <w:pPr>
+              <w:spacing w:after="0"/>
+            </w:pPr>
+            <w:r/>
+            <w:r>
+              <w:rPr>
+                <w:rFonts w:ascii="Arial" w:hAnsi="Arial"/>
+                <w:b w:val="0"/>
+                <w:sz w:val="17"/>
+              </w:rPr>
+              <w:t>Test Scenario</w:t>
+            </w:r>
+          </w:p>
+        </w:tc>
+        <w:tc>
+          <w:tcPr>
+            <w:tcW w:type="dxa" w:w="6984"/>
+            <w:vAlign w:val="center"/>
+            <w:shd w:fill="FFFFFF"/>
+          </w:tcPr>
+          <w:p>
+            <w:pPr>
+              <w:spacing w:after="0"/>
+            </w:pPr>
+            <w:r/>
+            <w:r>
+              <w:rPr>
+                <w:rFonts w:ascii="Arial" w:hAnsi="Arial"/>
+                <w:b w:val="0"/>
+                <w:sz w:val="17"/>
+              </w:rPr>
+              <w:t>Automated regression suite</w:t>
+            </w:r>
+          </w:p>
+        </w:tc>
+      </w:tr>
+      <w:tr>
+        <w:tc>
+          <w:tcPr>
+            <w:tcW w:type="dxa" w:w="2232"/>
+            <w:vAlign w:val="center"/>
+            <w:shd w:fill="F3F6FA"/>
+          </w:tcPr>
+          <w:p>
+            <w:pPr>
+              <w:spacing w:after="0"/>
+            </w:pPr>
+            <w:r/>
+            <w:r>
+              <w:rPr>
+                <w:rFonts w:ascii="Arial" w:hAnsi="Arial"/>
+                <w:b w:val="0"/>
+                <w:sz w:val="17"/>
+              </w:rPr>
+              <w:t>Prerequisite 1</w:t>
+            </w:r>
+          </w:p>
+        </w:tc>
+        <w:tc>
+          <w:tcPr>
+            <w:tcW w:type="dxa" w:w="6984"/>
+            <w:vAlign w:val="center"/>
+            <w:shd w:fill="F3F6FA"/>
+          </w:tcPr>
+          <w:p>
+            <w:pPr>
+              <w:spacing w:after="0"/>
+            </w:pPr>
+            <w:r/>
+            <w:r>
+              <w:rPr>
+                <w:rFonts w:ascii="Arial" w:hAnsi="Arial"/>
+                <w:b w:val="0"/>
+                <w:sz w:val="17"/>
+              </w:rPr>
+              <w:t>Application running at http://127.0.0.1:8000</w:t>
+            </w:r>
+          </w:p>
+        </w:tc>
+      </w:tr>
+      <w:tr>
+        <w:tc>
+          <w:tcPr>
+            <w:tcW w:type="dxa" w:w="2232"/>
+            <w:vAlign w:val="center"/>
+            <w:shd w:fill="FFFFFF"/>
+          </w:tcPr>
+          <w:p>
+            <w:pPr>
+              <w:spacing w:after="0"/>
+            </w:pPr>
+            <w:r/>
+            <w:r>
+              <w:rPr>
+                <w:rFonts w:ascii="Arial" w:hAnsi="Arial"/>
+                <w:b w:val="0"/>
+                <w:sz w:val="17"/>
+              </w:rPr>
+              <w:t>Prerequisite 2</w:t>
+            </w:r>
+          </w:p>
+        </w:tc>
+        <w:tc>
+          <w:tcPr>
+            <w:tcW w:type="dxa" w:w="6984"/>
+            <w:vAlign w:val="center"/>
+            <w:shd w:fill="FFFFFF"/>
+          </w:tcPr>
+          <w:p>
+            <w:pPr>
+              <w:spacing w:after="0"/>
+            </w:pPr>
+            <w:r/>
+            <w:r>
+              <w:rPr>
+                <w:rFonts w:ascii="Arial" w:hAnsi="Arial"/>
+                <w:b w:val="0"/>
+                <w:sz w:val="17"/>
+              </w:rPr>
+              <w:t>Supported browser and appropriate test account</w:t>
+            </w:r>
+          </w:p>
+        </w:tc>
+      </w:tr>
+      <w:tr>
+        <w:tc>
+          <w:tcPr>
+            <w:tcW w:type="dxa" w:w="2232"/>
+            <w:vAlign w:val="center"/>
+            <w:shd w:fill="F3F6FA"/>
+          </w:tcPr>
+          <w:p>
+            <w:pPr>
+              <w:spacing w:after="0"/>
+            </w:pPr>
+            <w:r/>
+            <w:r>
+              <w:rPr>
+                <w:rFonts w:ascii="Arial" w:hAnsi="Arial"/>
+                <w:b w:val="0"/>
+                <w:sz w:val="17"/>
+              </w:rPr>
+              <w:t>Test Data</w:t>
+            </w:r>
+          </w:p>
+        </w:tc>
+        <w:tc>
+          <w:tcPr>
+            <w:tcW w:type="dxa" w:w="6984"/>
+            <w:vAlign w:val="center"/>
+            <w:shd w:fill="F3F6FA"/>
+          </w:tcPr>
+          <w:p>
+            <w:pPr>
+              <w:spacing w:after="0"/>
+            </w:pPr>
+            <w:r/>
+            <w:r>
+              <w:rPr>
+                <w:rFonts w:ascii="Arial" w:hAnsi="Arial"/>
+                <w:b w:val="0"/>
+                <w:sz w:val="17"/>
+              </w:rPr>
+              <w:t>PHPUnit feature and unit tests</w:t>
+            </w:r>
+          </w:p>
+        </w:tc>
+      </w:tr>
+    </w:tbl>
+    <w:p>
+      <w:pPr>
+        <w:spacing w:after="40"/>
+      </w:pPr>
+    </w:p>
+    <w:tbl>
+      <w:tblPr>
+        <w:tblW w:type="auto" w:w="0"/>
+        <w:jc w:val="center"/>
+        <w:tblLayout w:type="fixed"/>
+        <w:tblLook w:firstColumn="1" w:firstRow="1" w:lastColumn="0" w:lastRow="0" w:noHBand="0" w:noVBand="1" w:val="04A0"/>
+        <w:tblBorders>
+          <w:top w:val="single" w:sz="4" w:color="B4C6E7"/>
+          <w:left w:val="single" w:sz="4" w:color="B4C6E7"/>
+          <w:bottom w:val="single" w:sz="4" w:color="B4C6E7"/>
+          <w:right w:val="single" w:sz="4" w:color="B4C6E7"/>
+          <w:insideH w:val="single" w:sz="4" w:color="B4C6E7"/>
+          <w:insideV w:val="single" w:sz="4" w:color="B4C6E7"/>
+        </w:tblBorders>
+      </w:tblPr>
+      <w:tblGrid>
+        <w:gridCol w:w="1987"/>
+        <w:gridCol w:w="1987"/>
+        <w:gridCol w:w="1987"/>
+        <w:gridCol w:w="1987"/>
+        <w:gridCol w:w="1987"/>
+      </w:tblGrid>
+      <w:tr>
+        <w:tc>
+          <w:tcPr>
+            <w:tcW w:type="dxa" w:w="648"/>
+            <w:vAlign w:val="center"/>
+            <w:shd w:fill="4472C4"/>
+          </w:tcPr>
+          <w:p>
+            <w:pPr>
+              <w:spacing w:after="0"/>
+            </w:pPr>
+            <w:r/>
+            <w:r>
+              <w:rPr>
+                <w:rFonts w:ascii="Arial" w:hAnsi="Arial"/>
+                <w:b/>
+                <w:color w:val="FFFFFF"/>
+                <w:sz w:val="16"/>
+              </w:rPr>
+              <w:t>Step</w:t>
+            </w:r>
+          </w:p>
+        </w:tc>
+        <w:tc>
+          <w:tcPr>
+            <w:tcW w:type="dxa" w:w="2664"/>
+            <w:vAlign w:val="center"/>
+            <w:shd w:fill="4472C4"/>
+          </w:tcPr>
+          <w:p>
+            <w:pPr>
+              <w:spacing w:after="0"/>
+            </w:pPr>
+            <w:r/>
+            <w:r>
+              <w:rPr>
+                <w:rFonts w:ascii="Arial" w:hAnsi="Arial"/>
+                <w:b/>
+                <w:color w:val="FFFFFF"/>
+                <w:sz w:val="16"/>
+              </w:rPr>
+              <w:t>Action</w:t>
+            </w:r>
+          </w:p>
+        </w:tc>
+        <w:tc>
+          <w:tcPr>
+            <w:tcW w:type="dxa" w:w="2736"/>
+            <w:vAlign w:val="center"/>
+            <w:shd w:fill="4472C4"/>
+          </w:tcPr>
+          <w:p>
+            <w:pPr>
+              <w:spacing w:after="0"/>
+            </w:pPr>
+            <w:r/>
+            <w:r>
+              <w:rPr>
+                <w:rFonts w:ascii="Arial" w:hAnsi="Arial"/>
+                <w:b/>
+                <w:color w:val="FFFFFF"/>
+                <w:sz w:val="16"/>
+              </w:rPr>
+              <w:t>Expected Result</w:t>
+            </w:r>
+          </w:p>
+        </w:tc>
+        <w:tc>
+          <w:tcPr>
+            <w:tcW w:type="dxa" w:w="1872"/>
+            <w:vAlign w:val="center"/>
+            <w:shd w:fill="4472C4"/>
+          </w:tcPr>
+          <w:p>
+            <w:pPr>
+              <w:spacing w:after="0"/>
+            </w:pPr>
+            <w:r/>
+            <w:r>
+              <w:rPr>
+                <w:rFonts w:ascii="Arial" w:hAnsi="Arial"/>
+                <w:b/>
+                <w:color w:val="FFFFFF"/>
+                <w:sz w:val="16"/>
+              </w:rPr>
+              <w:t>Actual Result</w:t>
+            </w:r>
+          </w:p>
+        </w:tc>
+        <w:tc>
+          <w:tcPr>
+            <w:tcW w:type="dxa" w:w="1008"/>
+            <w:vAlign w:val="center"/>
+            <w:shd w:fill="4472C4"/>
+          </w:tcPr>
+          <w:p>
+            <w:pPr>
+              <w:spacing w:after="0"/>
+            </w:pPr>
+            <w:r/>
+            <w:r>
+              <w:rPr>
+                <w:rFonts w:ascii="Arial" w:hAnsi="Arial"/>
+                <w:b/>
+                <w:color w:val="FFFFFF"/>
+                <w:sz w:val="16"/>
+              </w:rPr>
+              <w:t>Status</w:t>
+            </w:r>
+          </w:p>
+        </w:tc>
+      </w:tr>
+      <w:tr>
+        <w:tc>
+          <w:tcPr>
+            <w:tcW w:type="dxa" w:w="648"/>
+            <w:vAlign w:val="center"/>
+            <w:shd w:fill="FFFFFF"/>
+          </w:tcPr>
+          <w:p>
+            <w:pPr>
+              <w:spacing w:after="0"/>
+            </w:pPr>
+            <w:r/>
+            <w:r>
+              <w:rPr>
+                <w:rFonts w:ascii="Arial" w:hAnsi="Arial"/>
+                <w:b w:val="0"/>
+                <w:sz w:val="16"/>
+              </w:rPr>
+              <w:t>1</w:t>
+            </w:r>
+          </w:p>
+        </w:tc>
+        <w:tc>
+          <w:tcPr>
+            <w:tcW w:type="dxa" w:w="2664"/>
+            <w:vAlign w:val="center"/>
+            <w:shd w:fill="FFFFFF"/>
+          </w:tcPr>
+          <w:p>
+            <w:pPr>
+              <w:spacing w:after="0"/>
+            </w:pPr>
+            <w:r/>
+            <w:r>
+              <w:rPr>
+                <w:rFonts w:ascii="Arial" w:hAnsi="Arial"/>
+                <w:b w:val="0"/>
+                <w:sz w:val="16"/>
+              </w:rPr>
               <w:t>Run the project test suite</w:t>
             </w:r>
           </w:p>
@@ -23085,7 +26181,7 @@
                 <w:b w:val="0"/>
                 <w:sz w:val="16"/>
               </w:rPr>
-              <w:t>25 tests and 62 assertions pass with zero failures</w:t>
+              <w:t>26 tests and 65 assertions pass with zero failures</w:t>
             </w:r>
           </w:p>
         </w:tc>

</xml_diff>